<commit_message>
compiled features Echo - will need to organize the document
</commit_message>
<xml_diff>
--- a/Iteration_2/Echo_Review/final_submission/feature_proposal.docx
+++ b/Iteration_2/Echo_Review/final_submission/feature_proposal.docx
@@ -4,6 +4,9 @@
   <w:body>
     <w:p>
       <w:r>
+        <w:rPr>
+          <w:noProof/>
+        </w:rPr>
         <w:drawing>
           <wp:inline distT="0" distB="0" distL="0" distR="0" wp14:anchorId="67A8AC93" wp14:editId="5D67F521">
             <wp:extent cx="5943600" cy="3551555"/>
@@ -66,6 +69,635 @@
       <w:r>
         <w:t>in calculating rating points for SBMM</w:t>
       </w:r>
+    </w:p>
+    <w:p>
+      <w:pPr>
+        <w:ind w:left="720"/>
+      </w:pPr>
+    </w:p>
+    <w:p>
+      <w:pPr>
+        <w:ind w:left="720"/>
+        <w:rPr>
+          <w:b/>
+          <w:bCs/>
+        </w:rPr>
+      </w:pPr>
+      <w:r>
+        <w:rPr>
+          <w:b/>
+          <w:bCs/>
+        </w:rPr>
+        <w:t>**Comparator Method**</w:t>
+      </w:r>
+      <w:r>
+        <w:rPr>
+          <w:b/>
+          <w:bCs/>
+        </w:rPr>
+        <w:br/>
+      </w:r>
+      <w:r>
+        <w:rPr>
+          <w:b/>
+          <w:bCs/>
+        </w:rPr>
+        <w:br/>
+        <w:t xml:space="preserve">Currently, the team uses rank in an </w:t>
+      </w:r>
+      <w:proofErr w:type="spellStart"/>
+      <w:r>
+        <w:rPr>
+          <w:b/>
+          <w:bCs/>
+        </w:rPr>
+        <w:t>enum</w:t>
+      </w:r>
+      <w:proofErr w:type="spellEnd"/>
+      <w:r>
+        <w:rPr>
+          <w:b/>
+          <w:bCs/>
+        </w:rPr>
+        <w:t xml:space="preserve"> to denote the different status of players. </w:t>
+      </w:r>
+      <w:r>
+        <w:rPr>
+          <w:b/>
+          <w:bCs/>
+        </w:rPr>
+        <w:br/>
+        <w:t xml:space="preserve">However, the leaderboard handler does not have a way to rank these players other than to use rank. </w:t>
+      </w:r>
+      <w:r>
+        <w:rPr>
+          <w:b/>
+          <w:bCs/>
+        </w:rPr>
+        <w:br/>
+        <w:t xml:space="preserve">The team can use other statistics such as moves or games played to order these players. The comparator can take these </w:t>
+      </w:r>
+      <w:r>
+        <w:rPr>
+          <w:b/>
+          <w:bCs/>
+        </w:rPr>
+        <w:br/>
+        <w:t xml:space="preserve">inputs and order these players accordingly creating a complex way to show how you stack up against other players </w:t>
+      </w:r>
+      <w:r>
+        <w:rPr>
+          <w:b/>
+          <w:bCs/>
+        </w:rPr>
+        <w:br/>
+        <w:t xml:space="preserve">instead of just using a set </w:t>
+      </w:r>
+      <w:proofErr w:type="spellStart"/>
+      <w:r>
+        <w:rPr>
+          <w:b/>
+          <w:bCs/>
+        </w:rPr>
+        <w:t>enum</w:t>
+      </w:r>
+      <w:proofErr w:type="spellEnd"/>
+      <w:r>
+        <w:rPr>
+          <w:b/>
+          <w:bCs/>
+        </w:rPr>
+        <w:t xml:space="preserve"> constant. </w:t>
+      </w:r>
+      <w:r>
+        <w:rPr>
+          <w:b/>
+          <w:bCs/>
+        </w:rPr>
+        <w:br/>
+      </w:r>
+      <w:r>
+        <w:rPr>
+          <w:b/>
+          <w:bCs/>
+        </w:rPr>
+        <w:br/>
+        <w:t>**Reasons to implement**:</w:t>
+      </w:r>
+      <w:r>
+        <w:rPr>
+          <w:b/>
+          <w:bCs/>
+        </w:rPr>
+        <w:br/>
+        <w:t>1. **Complex user interaction**: Comparator allows the leaderboard to organize players based on different criteria,</w:t>
+      </w:r>
+      <w:r>
+        <w:rPr>
+          <w:b/>
+          <w:bCs/>
+        </w:rPr>
+        <w:br/>
+        <w:t>and even based on various factors combined. This allows for richer and personalized view of their statistics</w:t>
+      </w:r>
+      <w:r>
+        <w:rPr>
+          <w:b/>
+          <w:bCs/>
+        </w:rPr>
+        <w:br/>
+        <w:t>and possible ways to improve gameplay.</w:t>
+      </w:r>
+      <w:r>
+        <w:rPr>
+          <w:b/>
+          <w:bCs/>
+        </w:rPr>
+        <w:br/>
+      </w:r>
+      <w:r>
+        <w:rPr>
+          <w:b/>
+          <w:bCs/>
+        </w:rPr>
+        <w:br/>
+        <w:t xml:space="preserve">2. **Diverse </w:t>
+      </w:r>
+      <w:proofErr w:type="gramStart"/>
+      <w:r>
+        <w:rPr>
+          <w:b/>
+          <w:bCs/>
+        </w:rPr>
+        <w:t>audience:*</w:t>
+      </w:r>
+      <w:proofErr w:type="gramEnd"/>
+      <w:r>
+        <w:rPr>
+          <w:b/>
+          <w:bCs/>
+        </w:rPr>
+        <w:t xml:space="preserve">* Allows for better strategies that the user can aim for such as </w:t>
+      </w:r>
+      <w:r>
+        <w:rPr>
+          <w:b/>
+          <w:bCs/>
+        </w:rPr>
+        <w:lastRenderedPageBreak/>
+        <w:t>speed runs or using as little movements as possible.</w:t>
+      </w:r>
+      <w:r>
+        <w:rPr>
+          <w:b/>
+          <w:bCs/>
+        </w:rPr>
+        <w:br/>
+        <w:t xml:space="preserve">This opens up for greater possibilities and allows the application to cater to various audience groups that </w:t>
+      </w:r>
+      <w:r>
+        <w:rPr>
+          <w:b/>
+          <w:bCs/>
+        </w:rPr>
+        <w:br/>
+        <w:t>may be interested in.</w:t>
+      </w:r>
+      <w:r>
+        <w:rPr>
+          <w:b/>
+          <w:bCs/>
+        </w:rPr>
+        <w:br/>
+      </w:r>
+      <w:r>
+        <w:rPr>
+          <w:b/>
+          <w:bCs/>
+        </w:rPr>
+        <w:br/>
+        <w:t>3. **Play testing**: Data can enable users and developers to see how to add challenges to the game and weaknesses that may lie within the</w:t>
+      </w:r>
+      <w:r>
+        <w:rPr>
+          <w:b/>
+          <w:bCs/>
+        </w:rPr>
+        <w:br/>
+        <w:t>game. Developers can then use this data to add updates to the game logic and/or balance certain player behaviour</w:t>
+      </w:r>
+      <w:r>
+        <w:rPr>
+          <w:b/>
+          <w:bCs/>
+        </w:rPr>
+        <w:br/>
+        <w:t xml:space="preserve">to ensure game is challenging and entertaining. </w:t>
+      </w:r>
+      <w:r>
+        <w:rPr>
+          <w:b/>
+          <w:bCs/>
+        </w:rPr>
+        <w:br/>
+      </w:r>
+      <w:r>
+        <w:rPr>
+          <w:b/>
+          <w:bCs/>
+        </w:rPr>
+        <w:br/>
+        <w:t>**Debug/Console Log**</w:t>
+      </w:r>
+      <w:r>
+        <w:rPr>
+          <w:b/>
+          <w:bCs/>
+        </w:rPr>
+        <w:br/>
+      </w:r>
+      <w:r>
+        <w:rPr>
+          <w:b/>
+          <w:bCs/>
+        </w:rPr>
+        <w:br/>
+        <w:t xml:space="preserve">A console log is beneficial for debugging since it can identify problems within the application. Each user inputs can </w:t>
+      </w:r>
+      <w:r>
+        <w:rPr>
+          <w:b/>
+          <w:bCs/>
+        </w:rPr>
+        <w:br/>
+        <w:t xml:space="preserve">have a message that is written to a log file and can be used by </w:t>
+      </w:r>
+      <w:proofErr w:type="spellStart"/>
+      <w:r>
+        <w:rPr>
+          <w:b/>
+          <w:bCs/>
+        </w:rPr>
+        <w:t>devs</w:t>
+      </w:r>
+      <w:proofErr w:type="spellEnd"/>
+      <w:r>
+        <w:rPr>
+          <w:b/>
+          <w:bCs/>
+        </w:rPr>
+        <w:t xml:space="preserve"> to improve the system. Additionally, it is useful to </w:t>
+      </w:r>
+      <w:r>
+        <w:rPr>
+          <w:b/>
+          <w:bCs/>
+        </w:rPr>
+        <w:br/>
+        <w:t xml:space="preserve">identify program crashes that may result from the GUI not initializing components properly. In principle these logs are </w:t>
+      </w:r>
+      <w:r>
+        <w:rPr>
+          <w:b/>
+          <w:bCs/>
+        </w:rPr>
+        <w:br/>
+        <w:t xml:space="preserve">written to the system output in the IDE, </w:t>
+      </w:r>
+      <w:proofErr w:type="gramStart"/>
+      <w:r>
+        <w:rPr>
+          <w:b/>
+          <w:bCs/>
+        </w:rPr>
+        <w:t>however</w:t>
+      </w:r>
+      <w:proofErr w:type="gramEnd"/>
+      <w:r>
+        <w:rPr>
+          <w:b/>
+          <w:bCs/>
+        </w:rPr>
+        <w:t xml:space="preserve"> can be saved to a file that is overwritten each time program initializes.</w:t>
+      </w:r>
+      <w:r>
+        <w:rPr>
+          <w:b/>
+          <w:bCs/>
+        </w:rPr>
+        <w:br/>
+      </w:r>
+      <w:r>
+        <w:rPr>
+          <w:b/>
+          <w:bCs/>
+        </w:rPr>
+        <w:br/>
+        <w:t xml:space="preserve">1. **Debugging </w:t>
+      </w:r>
+      <w:proofErr w:type="gramStart"/>
+      <w:r>
+        <w:rPr>
+          <w:b/>
+          <w:bCs/>
+        </w:rPr>
+        <w:t>Purposes:*</w:t>
+      </w:r>
+      <w:proofErr w:type="gramEnd"/>
+      <w:r>
+        <w:rPr>
+          <w:b/>
+          <w:bCs/>
+        </w:rPr>
+        <w:t>* By implementing error codes developers can quickly target errors and resolve issues appropriately.</w:t>
+      </w:r>
+      <w:r>
+        <w:rPr>
+          <w:b/>
+          <w:bCs/>
+        </w:rPr>
+        <w:br/>
+        <w:t xml:space="preserve">   These are particularly important for first iterations of developmental code to see side effects before code is created for production.</w:t>
+      </w:r>
+      <w:r>
+        <w:rPr>
+          <w:b/>
+          <w:bCs/>
+        </w:rPr>
+        <w:br/>
+      </w:r>
+      <w:r>
+        <w:rPr>
+          <w:b/>
+          <w:bCs/>
+        </w:rPr>
+        <w:br/>
+        <w:t xml:space="preserve">2. **User Accessibility**: Specific error logging ensures that the end user </w:t>
+      </w:r>
+      <w:proofErr w:type="gramStart"/>
+      <w:r>
+        <w:rPr>
+          <w:b/>
+          <w:bCs/>
+        </w:rPr>
+        <w:t>is able to</w:t>
+      </w:r>
+      <w:proofErr w:type="gramEnd"/>
+      <w:r>
+        <w:rPr>
+          <w:b/>
+          <w:bCs/>
+        </w:rPr>
+        <w:t xml:space="preserve"> report issues that may have skipped testing</w:t>
+      </w:r>
+      <w:r>
+        <w:rPr>
+          <w:b/>
+          <w:bCs/>
+        </w:rPr>
+        <w:br/>
+        <w:t xml:space="preserve">   phase, which then can be relayed to developers who can issue patches. Additionally, developer can see the sequence of behaviour that</w:t>
+      </w:r>
+      <w:r>
+        <w:rPr>
+          <w:b/>
+          <w:bCs/>
+        </w:rPr>
+        <w:br/>
+        <w:t xml:space="preserve">   lead the end user to encounter the specific bug.</w:t>
+      </w:r>
+      <w:r>
+        <w:rPr>
+          <w:b/>
+          <w:bCs/>
+        </w:rPr>
+        <w:br/>
+      </w:r>
+      <w:r>
+        <w:rPr>
+          <w:b/>
+          <w:bCs/>
+        </w:rPr>
+        <w:br/>
+        <w:t xml:space="preserve">3. **Testing Identification**: </w:t>
+      </w:r>
+      <w:proofErr w:type="gramStart"/>
+      <w:r>
+        <w:rPr>
+          <w:b/>
+          <w:bCs/>
+        </w:rPr>
+        <w:t>Similar to</w:t>
+      </w:r>
+      <w:proofErr w:type="gramEnd"/>
+      <w:r>
+        <w:rPr>
+          <w:b/>
+          <w:bCs/>
+        </w:rPr>
+        <w:t xml:space="preserve"> user accessibility, it can be difficult to pinpoint the specific behaviour that </w:t>
+      </w:r>
+      <w:r>
+        <w:rPr>
+          <w:b/>
+          <w:bCs/>
+        </w:rPr>
+        <w:br/>
+        <w:t>can cause unit testing to fail. By having a console log, developers can recreate the scenario and target the lines of</w:t>
+      </w:r>
+      <w:r>
+        <w:rPr>
+          <w:b/>
+          <w:bCs/>
+        </w:rPr>
+        <w:br/>
+        <w:t xml:space="preserve">code that is causing the error to appear. </w:t>
+      </w:r>
+    </w:p>
+    <w:p>
+      <w:pPr>
+        <w:ind w:left="720"/>
+        <w:rPr>
+          <w:b/>
+          <w:bCs/>
+        </w:rPr>
+      </w:pPr>
+    </w:p>
+    <w:p>
+      <w:pPr>
+        <w:ind w:left="720"/>
+        <w:rPr>
+          <w:b/>
+          <w:bCs/>
+        </w:rPr>
+      </w:pPr>
+      <w:r>
+        <w:rPr>
+          <w:b/>
+          <w:bCs/>
+        </w:rPr>
+        <w:t>Feature Proposal: Have three different teams. This is likely the reason why the</w:t>
+      </w:r>
+      <w:r>
+        <w:rPr>
+          <w:b/>
+          <w:bCs/>
+        </w:rPr>
+        <w:br/>
+        <w:t>group went a bit overboard on Networking. It would have been more productive to</w:t>
+      </w:r>
+      <w:r>
+        <w:rPr>
+          <w:b/>
+          <w:bCs/>
+        </w:rPr>
+        <w:br/>
+        <w:t>merge the responsibilities of the two other teams into the Networking team, with</w:t>
+      </w:r>
+      <w:r>
+        <w:rPr>
+          <w:b/>
+          <w:bCs/>
+        </w:rPr>
+        <w:br/>
+        <w:t>the Backend handling game logic and the Frontend focusing on the GUI. This way,</w:t>
+      </w:r>
+      <w:r>
+        <w:rPr>
+          <w:b/>
+          <w:bCs/>
+        </w:rPr>
+        <w:br/>
+      </w:r>
+      <w:r>
+        <w:rPr>
+          <w:b/>
+          <w:bCs/>
+        </w:rPr>
+        <w:lastRenderedPageBreak/>
+        <w:t>the Networking team wouldn't have to go unnecessarily in-depth on a</w:t>
+      </w:r>
+      <w:r>
+        <w:rPr>
+          <w:b/>
+          <w:bCs/>
+        </w:rPr>
+        <w:br/>
+        <w:t>synchronization plan. That said, I understand why they put so much effort into</w:t>
+      </w:r>
+      <w:r>
+        <w:rPr>
+          <w:b/>
+          <w:bCs/>
+        </w:rPr>
+        <w:br/>
+        <w:t xml:space="preserve">this—it’s </w:t>
+      </w:r>
+      <w:proofErr w:type="gramStart"/>
+      <w:r>
+        <w:rPr>
+          <w:b/>
+          <w:bCs/>
+        </w:rPr>
+        <w:t>definitely above</w:t>
+      </w:r>
+      <w:proofErr w:type="gramEnd"/>
+      <w:r>
+        <w:rPr>
+          <w:b/>
+          <w:bCs/>
+        </w:rPr>
+        <w:t xml:space="preserve"> and beyond, but perhaps a little too ambitious for a</w:t>
+      </w:r>
+      <w:r>
+        <w:rPr>
+          <w:b/>
+          <w:bCs/>
+        </w:rPr>
+        <w:br/>
+        <w:t>SENG final project.</w:t>
+      </w:r>
+      <w:r>
+        <w:rPr>
+          <w:b/>
+          <w:bCs/>
+        </w:rPr>
+        <w:br/>
+      </w:r>
+      <w:r>
+        <w:rPr>
+          <w:b/>
+          <w:bCs/>
+        </w:rPr>
+        <w:br/>
+        <w:t xml:space="preserve">Feature Proposal: </w:t>
+      </w:r>
+      <w:r>
+        <w:rPr>
+          <w:b/>
+          <w:bCs/>
+        </w:rPr>
+        <w:br/>
+        <w:t>Since the group is working on multiple clients connecting to a server, you could</w:t>
+      </w:r>
+      <w:r>
+        <w:rPr>
+          <w:b/>
+          <w:bCs/>
+        </w:rPr>
+        <w:br/>
+        <w:t>use threads or processes to handle each client connection separately. This would</w:t>
+      </w:r>
+      <w:r>
+        <w:rPr>
+          <w:b/>
+          <w:bCs/>
+        </w:rPr>
+        <w:br/>
+        <w:t>make the server logic simpler and avoid the need for so many nested loops.</w:t>
+      </w:r>
+      <w:r>
+        <w:rPr>
+          <w:b/>
+          <w:bCs/>
+        </w:rPr>
+        <w:br/>
+        <w:t>Another option is to use a singleton class for simplicity, but the current loop</w:t>
+      </w:r>
+      <w:r>
+        <w:rPr>
+          <w:b/>
+          <w:bCs/>
+        </w:rPr>
+        <w:br/>
+        <w:t>idea seems tricky to implement and would likely be hard to debug. Switching to</w:t>
+      </w:r>
+      <w:r>
+        <w:rPr>
+          <w:b/>
+          <w:bCs/>
+        </w:rPr>
+        <w:br/>
+        <w:t>one of these approaches could make the system much easier to manage.</w:t>
+      </w:r>
+    </w:p>
+    <w:p>
+      <w:pPr>
+        <w:ind w:left="720"/>
+        <w:rPr>
+          <w:b/>
+          <w:bCs/>
+        </w:rPr>
+      </w:pPr>
+    </w:p>
+    <w:p>
+      <w:pPr>
+        <w:ind w:left="720"/>
+        <w:rPr>
+          <w:b/>
+          <w:bCs/>
+        </w:rPr>
+      </w:pPr>
     </w:p>
     <w:p/>
     <w:sectPr>

</xml_diff>

<commit_message>
updated feature proposals with Alan's format
</commit_message>
<xml_diff>
--- a/Iteration_2/Echo_Review/final_submission/feature_proposal.docx
+++ b/Iteration_2/Echo_Review/final_submission/feature_proposal.docx
@@ -4,11 +4,12 @@
   <w:body>
     <w:p>
       <w:pPr>
+        <w:jc w:val="center"/>
         <w:rPr>
           <w:b/>
           <w:bCs/>
-          <w:sz w:val="34"/>
-          <w:szCs w:val="34"/>
+          <w:sz w:val="36"/>
+          <w:szCs w:val="36"/>
           <w:u w:val="thick"/>
         </w:rPr>
       </w:pPr>
@@ -16,8 +17,8 @@
         <w:rPr>
           <w:b/>
           <w:bCs/>
-          <w:sz w:val="34"/>
-          <w:szCs w:val="34"/>
+          <w:sz w:val="36"/>
+          <w:szCs w:val="36"/>
           <w:u w:val="thick"/>
         </w:rPr>
         <w:t>Feature Proposals for Echo</w:t>
@@ -25,117 +26,127 @@
     </w:p>
     <w:p>
       <w:pPr>
-        <w:pStyle w:val="ListParagraph"/>
-        <w:numPr>
-          <w:ilvl w:val="0"/>
-          <w:numId w:val="2"/>
-        </w:numPr>
-        <w:rPr>
+        <w:rPr>
+          <w:b/>
+          <w:bCs/>
+          <w:sz w:val="30"/>
+          <w:szCs w:val="30"/>
+          <w:u w:val="single"/>
+        </w:rPr>
+      </w:pPr>
+    </w:p>
+    <w:p>
+      <w:pPr>
+        <w:rPr>
+          <w:b/>
+          <w:bCs/>
+          <w:sz w:val="30"/>
+          <w:szCs w:val="30"/>
+          <w:u w:val="single"/>
+        </w:rPr>
+      </w:pPr>
+      <w:r>
+        <w:rPr>
+          <w:b/>
+          <w:bCs/>
+          <w:sz w:val="30"/>
+          <w:szCs w:val="30"/>
+          <w:u w:val="single"/>
+        </w:rPr>
+        <w:t>Feature 1: Move Timers and Resignation</w:t>
+      </w:r>
+    </w:p>
+    <w:p>
+      <w:pPr>
+        <w:rPr>
+          <w:b/>
+          <w:bCs/>
           <w:sz w:val="28"/>
           <w:szCs w:val="28"/>
         </w:rPr>
       </w:pPr>
       <w:r>
         <w:rPr>
-          <w:sz w:val="26"/>
-          <w:szCs w:val="26"/>
-        </w:rPr>
-        <w:t xml:space="preserve">The first feature </w:t>
-      </w:r>
-      <w:r>
-        <w:rPr>
-          <w:sz w:val="26"/>
-          <w:szCs w:val="26"/>
-        </w:rPr>
-        <w:t>we propose is adding</w:t>
-      </w:r>
-      <w:r>
-        <w:rPr>
-          <w:sz w:val="26"/>
-          <w:szCs w:val="26"/>
-        </w:rPr>
-        <w:t xml:space="preserve"> a timer </w:t>
-      </w:r>
-      <w:r>
-        <w:rPr>
-          <w:sz w:val="26"/>
-          <w:szCs w:val="26"/>
-        </w:rPr>
-        <w:t>for the game sessions. This will ensure that if a player leaves in between, the 2</w:t>
-      </w:r>
-      <w:r>
-        <w:rPr>
-          <w:sz w:val="26"/>
-          <w:szCs w:val="26"/>
-          <w:vertAlign w:val="superscript"/>
-        </w:rPr>
-        <w:t>nd</w:t>
-      </w:r>
-      <w:r>
-        <w:rPr>
-          <w:sz w:val="26"/>
-          <w:szCs w:val="26"/>
-        </w:rPr>
-        <w:t xml:space="preserve"> player is not left waiting for the 1</w:t>
-      </w:r>
-      <w:r>
-        <w:rPr>
-          <w:sz w:val="26"/>
-          <w:szCs w:val="26"/>
-          <w:vertAlign w:val="superscript"/>
-        </w:rPr>
-        <w:t>st</w:t>
-      </w:r>
-      <w:r>
-        <w:rPr>
-          <w:sz w:val="26"/>
-          <w:szCs w:val="26"/>
-        </w:rPr>
-        <w:t xml:space="preserve"> player to move. Moreover, if the move timer runs out for any player, the game is automatically forfeited for that player, and the other player wins because of the timeout. Additionally, the skill-based </w:t>
-      </w:r>
-      <w:proofErr w:type="gramStart"/>
-      <w:r>
-        <w:rPr>
-          <w:sz w:val="26"/>
-          <w:szCs w:val="26"/>
-        </w:rPr>
-        <w:t>match-making</w:t>
-      </w:r>
-      <w:proofErr w:type="gramEnd"/>
-      <w:r>
-        <w:rPr>
-          <w:sz w:val="26"/>
-          <w:szCs w:val="26"/>
-        </w:rPr>
-        <w:t xml:space="preserve"> </w:t>
-      </w:r>
-      <w:r>
-        <w:rPr>
-          <w:sz w:val="26"/>
-          <w:szCs w:val="26"/>
-        </w:rPr>
-        <w:t>(</w:t>
-      </w:r>
-      <w:r>
-        <w:rPr>
+          <w:b/>
+          <w:bCs/>
           <w:sz w:val="28"/>
           <w:szCs w:val="28"/>
         </w:rPr>
-        <w:t>SBMM</w:t>
-      </w:r>
-      <w:r>
+        <w:t>Description:</w:t>
+      </w:r>
+    </w:p>
+    <w:p>
+      <w:pPr>
+        <w:pStyle w:val="ListParagraph"/>
         <w:rPr>
           <w:sz w:val="28"/>
           <w:szCs w:val="28"/>
         </w:rPr>
-        <w:t xml:space="preserve">) </w:t>
-      </w:r>
-      <w:r>
-        <w:rPr>
-          <w:sz w:val="26"/>
-          <w:szCs w:val="26"/>
-        </w:rPr>
-        <w:t>process should compensate for this. In addition, a resign button can be added that can allow any player to leave in between or exit the game in between. This will affect the ratings on the leaderboard as well so the match-making process should account for this.</w:t>
+      </w:pPr>
+      <w:r>
+        <w:rPr>
+          <w:sz w:val="26"/>
+          <w:szCs w:val="26"/>
+        </w:rPr>
+        <w:t xml:space="preserve">The first feature </w:t>
+      </w:r>
+      <w:r>
+        <w:rPr>
+          <w:sz w:val="26"/>
+          <w:szCs w:val="26"/>
+        </w:rPr>
+        <w:t>we propose is adding</w:t>
+      </w:r>
+      <w:r>
+        <w:rPr>
+          <w:sz w:val="26"/>
+          <w:szCs w:val="26"/>
+        </w:rPr>
+        <w:t xml:space="preserve"> a timer </w:t>
+      </w:r>
+      <w:r>
+        <w:rPr>
+          <w:sz w:val="26"/>
+          <w:szCs w:val="26"/>
+        </w:rPr>
+        <w:t>for the game sessions. This will ensure that if a player leaves in between, the 2</w:t>
+      </w:r>
+      <w:r>
+        <w:rPr>
+          <w:sz w:val="26"/>
+          <w:szCs w:val="26"/>
+          <w:vertAlign w:val="superscript"/>
+        </w:rPr>
+        <w:t>nd</w:t>
+      </w:r>
+      <w:r>
+        <w:rPr>
+          <w:sz w:val="26"/>
+          <w:szCs w:val="26"/>
+        </w:rPr>
+        <w:t xml:space="preserve"> player is not left waiting for the 1</w:t>
+      </w:r>
+      <w:r>
+        <w:rPr>
+          <w:sz w:val="26"/>
+          <w:szCs w:val="26"/>
+          <w:vertAlign w:val="superscript"/>
+        </w:rPr>
+        <w:t>st</w:t>
+      </w:r>
+      <w:r>
+        <w:rPr>
+          <w:sz w:val="26"/>
+          <w:szCs w:val="26"/>
+        </w:rPr>
+        <w:t xml:space="preserve"> player to move. Moreover, if the move timer runs out for any player, the game is automatically forfeited for that player, and the other player wins because of the timeout. Additionally, the skill-based </w:t>
+      </w:r>
+      <w:r>
+        <w:rPr>
+          <w:sz w:val="26"/>
+          <w:szCs w:val="26"/>
+        </w:rPr>
+        <w:t>matchmaking</w:t>
       </w:r>
       <w:r>
         <w:rPr>
@@ -143,49 +154,426 @@
           <w:szCs w:val="26"/>
         </w:rPr>
         <w:t xml:space="preserve"> </w:t>
+      </w:r>
+      <w:r>
+        <w:rPr>
+          <w:sz w:val="26"/>
+          <w:szCs w:val="26"/>
+        </w:rPr>
+        <w:t>(</w:t>
       </w:r>
       <w:r>
         <w:rPr>
           <w:sz w:val="28"/>
           <w:szCs w:val="28"/>
         </w:rPr>
-        <w:t>Use resignations as loss count to be used in calculating rating points for SBMM</w:t>
+        <w:t>SBMM</w:t>
       </w:r>
       <w:r>
         <w:rPr>
           <w:sz w:val="28"/>
           <w:szCs w:val="28"/>
         </w:rPr>
-        <w:t>.</w:t>
-      </w:r>
-    </w:p>
-    <w:p>
-      <w:pPr>
-        <w:pStyle w:val="ListParagraph"/>
+        <w:t xml:space="preserve">) </w:t>
+      </w:r>
+      <w:r>
+        <w:rPr>
+          <w:sz w:val="26"/>
+          <w:szCs w:val="26"/>
+        </w:rPr>
+        <w:t>process should compensate for this. In addition, a resign button can be added that can allow any player to leave in between or exit the game in between. This will affect the ratings on the leaderboard as well so the match-making process should account for this.</w:t>
+      </w:r>
+      <w:r>
+        <w:rPr>
+          <w:sz w:val="26"/>
+          <w:szCs w:val="26"/>
+        </w:rPr>
+        <w:t xml:space="preserve"> </w:t>
+      </w:r>
+      <w:r>
         <w:rPr>
           <w:sz w:val="28"/>
           <w:szCs w:val="28"/>
         </w:rPr>
-      </w:pPr>
+        <w:t>Use resignations as loss count to be used in calculating rating points for SBMM</w:t>
+      </w:r>
+      <w:r>
+        <w:rPr>
+          <w:sz w:val="28"/>
+          <w:szCs w:val="28"/>
+        </w:rPr>
+        <w:t>.</w:t>
+      </w:r>
     </w:p>
     <w:p>
       <w:pPr>
         <w:pStyle w:val="ListParagraph"/>
+        <w:rPr>
+          <w:sz w:val="28"/>
+          <w:szCs w:val="28"/>
+        </w:rPr>
+      </w:pPr>
+    </w:p>
+    <w:p>
+      <w:pPr>
+        <w:rPr>
+          <w:b/>
+          <w:bCs/>
+          <w:sz w:val="28"/>
+          <w:szCs w:val="28"/>
+        </w:rPr>
+      </w:pPr>
+      <w:r>
+        <w:rPr>
+          <w:b/>
+          <w:bCs/>
+          <w:sz w:val="28"/>
+          <w:szCs w:val="28"/>
+        </w:rPr>
+        <w:t>Impacts to the System:</w:t>
+      </w:r>
+    </w:p>
+    <w:p>
+      <w:pPr>
         <w:numPr>
-          <w:ilvl w:val="0"/>
-          <w:numId w:val="2"/>
+          <w:ilvl w:val="1"/>
+          <w:numId w:val="3"/>
         </w:numPr>
         <w:rPr>
           <w:sz w:val="26"/>
           <w:szCs w:val="26"/>
-        </w:rPr>
-      </w:pPr>
-      <w:r>
-        <w:rPr>
-          <w:sz w:val="26"/>
-          <w:szCs w:val="26"/>
-        </w:rPr>
-        <w:t>Since the group is working on multiple clients connecting to a server, you could</w:t>
+          <w:lang w:val="en"/>
+        </w:rPr>
+      </w:pPr>
+      <w:r>
+        <w:rPr>
+          <w:b/>
+          <w:sz w:val="26"/>
+          <w:szCs w:val="26"/>
+          <w:lang w:val="en"/>
+        </w:rPr>
+        <w:t>Session Ends</w:t>
+      </w:r>
+      <w:r>
+        <w:rPr>
+          <w:b/>
+          <w:sz w:val="26"/>
+          <w:szCs w:val="26"/>
+          <w:lang w:val="en"/>
+        </w:rPr>
+        <w:t xml:space="preserve">: </w:t>
+      </w:r>
+      <w:r>
+        <w:rPr>
+          <w:bCs/>
+          <w:sz w:val="26"/>
+          <w:szCs w:val="26"/>
+          <w:lang w:val="en"/>
+        </w:rPr>
+        <w:t>If the timer runs out or the player resigns, end the game session and bring it back to the home screen with a pop-up for the updated ratings</w:t>
+      </w:r>
+      <w:r>
+        <w:rPr>
+          <w:sz w:val="26"/>
+          <w:szCs w:val="26"/>
+          <w:lang w:val="en"/>
+        </w:rPr>
+        <w:t>.</w:t>
+      </w:r>
+    </w:p>
+    <w:p>
+      <w:pPr>
+        <w:numPr>
+          <w:ilvl w:val="1"/>
+          <w:numId w:val="3"/>
+        </w:numPr>
+        <w:rPr>
+          <w:sz w:val="26"/>
+          <w:szCs w:val="26"/>
+          <w:lang w:val="en"/>
+        </w:rPr>
+      </w:pPr>
+      <w:r>
+        <w:rPr>
+          <w:b/>
+          <w:sz w:val="26"/>
+          <w:szCs w:val="26"/>
+          <w:lang w:val="en"/>
+        </w:rPr>
+        <w:t xml:space="preserve">Notification System: </w:t>
+      </w:r>
+      <w:r>
+        <w:rPr>
+          <w:sz w:val="26"/>
+          <w:szCs w:val="26"/>
+          <w:lang w:val="en"/>
+        </w:rPr>
+        <w:t>Notification to the user that time is running out. Confirmation to the user if they want to resign.</w:t>
+      </w:r>
+    </w:p>
+    <w:p>
+      <w:pPr>
+        <w:ind w:left="1440"/>
+        <w:rPr>
+          <w:sz w:val="26"/>
+          <w:szCs w:val="26"/>
+          <w:lang w:val="en"/>
+        </w:rPr>
+      </w:pPr>
+    </w:p>
+    <w:p>
+      <w:pPr>
+        <w:rPr>
+          <w:sz w:val="28"/>
+          <w:szCs w:val="28"/>
+          <w:lang w:val="en"/>
+        </w:rPr>
+      </w:pPr>
+      <w:r>
+        <w:rPr>
+          <w:b/>
+          <w:sz w:val="28"/>
+          <w:szCs w:val="28"/>
+          <w:lang w:val="en"/>
+        </w:rPr>
+        <w:t>Implementation and Design Suggestions:</w:t>
+      </w:r>
+    </w:p>
+    <w:p>
+      <w:pPr>
+        <w:numPr>
+          <w:ilvl w:val="1"/>
+          <w:numId w:val="3"/>
+        </w:numPr>
+        <w:rPr>
+          <w:sz w:val="26"/>
+          <w:szCs w:val="26"/>
+          <w:lang w:val="en"/>
+        </w:rPr>
+      </w:pPr>
+      <w:r>
+        <w:rPr>
+          <w:sz w:val="26"/>
+          <w:szCs w:val="26"/>
+          <w:lang w:val="en"/>
+        </w:rPr>
+        <w:t>Add a move timer in the UI</w:t>
+      </w:r>
+    </w:p>
+    <w:p>
+      <w:pPr>
+        <w:numPr>
+          <w:ilvl w:val="1"/>
+          <w:numId w:val="3"/>
+        </w:numPr>
+        <w:rPr>
+          <w:sz w:val="26"/>
+          <w:szCs w:val="26"/>
+          <w:lang w:val="en"/>
+        </w:rPr>
+      </w:pPr>
+      <w:r>
+        <w:rPr>
+          <w:sz w:val="26"/>
+          <w:szCs w:val="26"/>
+          <w:lang w:val="en"/>
+        </w:rPr>
+        <w:t>Add resign button</w:t>
+      </w:r>
+    </w:p>
+    <w:p>
+      <w:pPr>
+        <w:numPr>
+          <w:ilvl w:val="1"/>
+          <w:numId w:val="3"/>
+        </w:numPr>
+        <w:rPr>
+          <w:sz w:val="26"/>
+          <w:szCs w:val="26"/>
+          <w:lang w:val="en"/>
+        </w:rPr>
+      </w:pPr>
+      <w:r>
+        <w:rPr>
+          <w:sz w:val="26"/>
+          <w:szCs w:val="26"/>
+          <w:lang w:val="en"/>
+        </w:rPr>
+        <w:t>Make a function that connects the user resignation to ratings and updates the leader board.</w:t>
+      </w:r>
+    </w:p>
+    <w:p>
+      <w:pPr>
+        <w:rPr>
+          <w:sz w:val="26"/>
+          <w:szCs w:val="26"/>
+          <w:lang w:val="en"/>
+        </w:rPr>
+      </w:pPr>
+    </w:p>
+    <w:p>
+      <w:pPr>
+        <w:rPr>
+          <w:sz w:val="28"/>
+          <w:szCs w:val="28"/>
+        </w:rPr>
+      </w:pPr>
+    </w:p>
+    <w:p>
+      <w:pPr>
+        <w:rPr>
+          <w:b/>
+          <w:bCs/>
+          <w:sz w:val="30"/>
+          <w:szCs w:val="30"/>
+          <w:u w:val="single"/>
+        </w:rPr>
+      </w:pPr>
+      <w:r>
+        <w:rPr>
+          <w:b/>
+          <w:bCs/>
+          <w:sz w:val="30"/>
+          <w:szCs w:val="30"/>
+          <w:u w:val="single"/>
+        </w:rPr>
+        <w:lastRenderedPageBreak/>
+        <w:t xml:space="preserve">Feature </w:t>
+      </w:r>
+      <w:r>
+        <w:rPr>
+          <w:b/>
+          <w:bCs/>
+          <w:sz w:val="30"/>
+          <w:szCs w:val="30"/>
+          <w:u w:val="single"/>
+        </w:rPr>
+        <w:t>2</w:t>
+      </w:r>
+      <w:r>
+        <w:rPr>
+          <w:b/>
+          <w:bCs/>
+          <w:sz w:val="30"/>
+          <w:szCs w:val="30"/>
+          <w:u w:val="single"/>
+        </w:rPr>
+        <w:t>:</w:t>
+      </w:r>
+      <w:r>
+        <w:rPr>
+          <w:b/>
+          <w:bCs/>
+          <w:sz w:val="30"/>
+          <w:szCs w:val="30"/>
+          <w:u w:val="single"/>
+        </w:rPr>
+        <w:t xml:space="preserve"> Debug Console</w:t>
+      </w:r>
+    </w:p>
+    <w:p>
+      <w:pPr>
+        <w:rPr>
+          <w:b/>
+          <w:bCs/>
+          <w:sz w:val="28"/>
+          <w:szCs w:val="28"/>
+        </w:rPr>
+      </w:pPr>
+      <w:r>
+        <w:rPr>
+          <w:b/>
+          <w:bCs/>
+          <w:sz w:val="28"/>
+          <w:szCs w:val="28"/>
+        </w:rPr>
+        <w:t>Description:</w:t>
+      </w:r>
+    </w:p>
+    <w:p>
+      <w:pPr>
+        <w:pStyle w:val="ListParagraph"/>
+        <w:rPr>
+          <w:sz w:val="26"/>
+          <w:szCs w:val="26"/>
+        </w:rPr>
+      </w:pPr>
+      <w:r>
+        <w:rPr>
+          <w:sz w:val="26"/>
+          <w:szCs w:val="26"/>
+        </w:rPr>
+        <w:t>Adding a debug console can be beneficial for not only the developers but also the users as</w:t>
+      </w:r>
+      <w:r>
+        <w:rPr>
+          <w:sz w:val="26"/>
+          <w:szCs w:val="26"/>
+        </w:rPr>
+        <w:t xml:space="preserve"> s</w:t>
+      </w:r>
+      <w:r>
+        <w:rPr>
+          <w:sz w:val="26"/>
+          <w:szCs w:val="26"/>
+        </w:rPr>
+        <w:t xml:space="preserve">pecific error logging </w:t>
+      </w:r>
+      <w:r>
+        <w:rPr>
+          <w:sz w:val="26"/>
+          <w:szCs w:val="26"/>
+        </w:rPr>
+        <w:t>can ensure</w:t>
+      </w:r>
+      <w:r>
+        <w:rPr>
+          <w:sz w:val="26"/>
+          <w:szCs w:val="26"/>
+        </w:rPr>
+        <w:t xml:space="preserve"> that the end user </w:t>
+      </w:r>
+      <w:r>
+        <w:rPr>
+          <w:sz w:val="26"/>
+          <w:szCs w:val="26"/>
+        </w:rPr>
+        <w:t>can</w:t>
+      </w:r>
+      <w:r>
+        <w:rPr>
+          <w:sz w:val="26"/>
+          <w:szCs w:val="26"/>
+        </w:rPr>
+        <w:t xml:space="preserve"> report issues that may have </w:t>
+      </w:r>
+      <w:r>
+        <w:rPr>
+          <w:sz w:val="26"/>
+          <w:szCs w:val="26"/>
+        </w:rPr>
+        <w:t xml:space="preserve">been </w:t>
+      </w:r>
+      <w:r>
+        <w:rPr>
+          <w:sz w:val="26"/>
+          <w:szCs w:val="26"/>
+        </w:rPr>
+        <w:t xml:space="preserve">skipped </w:t>
+      </w:r>
+      <w:r>
+        <w:rPr>
+          <w:sz w:val="26"/>
+          <w:szCs w:val="26"/>
+        </w:rPr>
+        <w:t xml:space="preserve">in the </w:t>
+      </w:r>
+      <w:r>
+        <w:rPr>
+          <w:sz w:val="26"/>
+          <w:szCs w:val="26"/>
+        </w:rPr>
+        <w:t>testing</w:t>
       </w:r>
       <w:r>
         <w:rPr>
@@ -199,63 +587,63 @@
           <w:sz w:val="26"/>
           <w:szCs w:val="26"/>
         </w:rPr>
-        <w:t>use threads or processes to handle each client connection separately. This would</w:t>
-      </w:r>
-      <w:r>
-        <w:rPr>
-          <w:sz w:val="26"/>
-          <w:szCs w:val="26"/>
-        </w:rPr>
-        <w:t xml:space="preserve"> </w:t>
-      </w:r>
-      <w:r>
-        <w:rPr>
-          <w:sz w:val="26"/>
-          <w:szCs w:val="26"/>
-        </w:rPr>
-        <w:t>make the server logic simpler and avoid the need for so many nested loops.</w:t>
-      </w:r>
-      <w:r>
-        <w:rPr>
-          <w:sz w:val="26"/>
-          <w:szCs w:val="26"/>
-        </w:rPr>
-        <w:t xml:space="preserve"> </w:t>
-      </w:r>
-      <w:r>
-        <w:rPr>
-          <w:sz w:val="26"/>
-          <w:szCs w:val="26"/>
-        </w:rPr>
-        <w:t>Another option is to use a singleton class for simplicity, but the current loop</w:t>
-      </w:r>
-      <w:r>
-        <w:rPr>
-          <w:sz w:val="26"/>
-          <w:szCs w:val="26"/>
-        </w:rPr>
-        <w:t xml:space="preserve"> </w:t>
-      </w:r>
-      <w:r>
-        <w:rPr>
-          <w:sz w:val="26"/>
-          <w:szCs w:val="26"/>
-        </w:rPr>
-        <w:t>idea seems tricky to implement and would likely be hard to debug. Switching to</w:t>
-      </w:r>
-      <w:r>
-        <w:rPr>
-          <w:sz w:val="26"/>
-          <w:szCs w:val="26"/>
-        </w:rPr>
-        <w:t xml:space="preserve"> </w:t>
-      </w:r>
-      <w:r>
-        <w:rPr>
-          <w:sz w:val="26"/>
-          <w:szCs w:val="26"/>
-        </w:rPr>
-        <w:t>one of these approaches could make the system much easier to manage.</w:t>
+        <w:t xml:space="preserve">phase, which then can be relayed to developers who can issue patches. Additionally, </w:t>
+      </w:r>
+      <w:r>
+        <w:rPr>
+          <w:sz w:val="26"/>
+          <w:szCs w:val="26"/>
+        </w:rPr>
+        <w:t xml:space="preserve">the </w:t>
+      </w:r>
+      <w:r>
+        <w:rPr>
+          <w:sz w:val="26"/>
+          <w:szCs w:val="26"/>
+        </w:rPr>
+        <w:t>developer</w:t>
+      </w:r>
+      <w:r>
+        <w:rPr>
+          <w:sz w:val="26"/>
+          <w:szCs w:val="26"/>
+        </w:rPr>
+        <w:t>s</w:t>
+      </w:r>
+      <w:r>
+        <w:rPr>
+          <w:sz w:val="26"/>
+          <w:szCs w:val="26"/>
+        </w:rPr>
+        <w:t xml:space="preserve"> can see the sequence of </w:t>
+      </w:r>
+      <w:r>
+        <w:rPr>
+          <w:sz w:val="26"/>
+          <w:szCs w:val="26"/>
+        </w:rPr>
+        <w:t>behavior</w:t>
+      </w:r>
+      <w:r>
+        <w:rPr>
+          <w:sz w:val="26"/>
+          <w:szCs w:val="26"/>
+        </w:rPr>
+        <w:t xml:space="preserve"> that</w:t>
+      </w:r>
+      <w:r>
+        <w:rPr>
+          <w:sz w:val="26"/>
+          <w:szCs w:val="26"/>
+        </w:rPr>
+        <w:t xml:space="preserve"> leads</w:t>
+      </w:r>
+      <w:r>
+        <w:rPr>
+          <w:sz w:val="26"/>
+          <w:szCs w:val="26"/>
+        </w:rPr>
+        <w:t xml:space="preserve"> the end user to encounter the specific bug.</w:t>
       </w:r>
     </w:p>
     <w:p>
@@ -269,162 +657,158 @@
     </w:p>
     <w:p>
       <w:pPr>
-        <w:pStyle w:val="ListParagraph"/>
+        <w:rPr>
+          <w:b/>
+          <w:bCs/>
+          <w:sz w:val="28"/>
+          <w:szCs w:val="28"/>
+        </w:rPr>
+      </w:pPr>
+      <w:r>
+        <w:rPr>
+          <w:b/>
+          <w:bCs/>
+          <w:sz w:val="28"/>
+          <w:szCs w:val="28"/>
+        </w:rPr>
+        <w:t>Impacts to the System:</w:t>
+      </w:r>
+    </w:p>
+    <w:p>
+      <w:pPr>
         <w:numPr>
-          <w:ilvl w:val="0"/>
-          <w:numId w:val="2"/>
+          <w:ilvl w:val="1"/>
+          <w:numId w:val="3"/>
         </w:numPr>
         <w:rPr>
           <w:sz w:val="26"/>
           <w:szCs w:val="26"/>
-        </w:rPr>
-      </w:pPr>
-      <w:r>
-        <w:rPr>
-          <w:sz w:val="26"/>
-          <w:szCs w:val="26"/>
-        </w:rPr>
-        <w:t>Adding a debug console can be beneficial for not only the developers but also the users as</w:t>
-      </w:r>
-      <w:r>
-        <w:rPr>
-          <w:sz w:val="26"/>
-          <w:szCs w:val="26"/>
-        </w:rPr>
-        <w:t xml:space="preserve"> s</w:t>
-      </w:r>
-      <w:r>
-        <w:rPr>
-          <w:sz w:val="26"/>
-          <w:szCs w:val="26"/>
-        </w:rPr>
-        <w:t xml:space="preserve">pecific error logging </w:t>
-      </w:r>
-      <w:r>
-        <w:rPr>
-          <w:sz w:val="26"/>
-          <w:szCs w:val="26"/>
-        </w:rPr>
-        <w:t>can ensure</w:t>
-      </w:r>
-      <w:r>
-        <w:rPr>
-          <w:sz w:val="26"/>
-          <w:szCs w:val="26"/>
-        </w:rPr>
-        <w:t xml:space="preserve"> that the end user </w:t>
-      </w:r>
-      <w:r>
-        <w:rPr>
-          <w:sz w:val="26"/>
-          <w:szCs w:val="26"/>
-        </w:rPr>
-        <w:t>can</w:t>
-      </w:r>
-      <w:r>
-        <w:rPr>
-          <w:sz w:val="26"/>
-          <w:szCs w:val="26"/>
-        </w:rPr>
-        <w:t xml:space="preserve"> report issues that may have </w:t>
-      </w:r>
-      <w:r>
-        <w:rPr>
-          <w:sz w:val="26"/>
-          <w:szCs w:val="26"/>
-        </w:rPr>
-        <w:t xml:space="preserve">been </w:t>
-      </w:r>
-      <w:r>
-        <w:rPr>
-          <w:sz w:val="26"/>
-          <w:szCs w:val="26"/>
-        </w:rPr>
-        <w:t xml:space="preserve">skipped </w:t>
-      </w:r>
-      <w:r>
-        <w:rPr>
-          <w:sz w:val="26"/>
-          <w:szCs w:val="26"/>
-        </w:rPr>
-        <w:t xml:space="preserve">in the </w:t>
-      </w:r>
-      <w:r>
-        <w:rPr>
-          <w:sz w:val="26"/>
-          <w:szCs w:val="26"/>
-        </w:rPr>
-        <w:t>testing</w:t>
-      </w:r>
-      <w:r>
-        <w:rPr>
-          <w:sz w:val="26"/>
-          <w:szCs w:val="26"/>
-        </w:rPr>
-        <w:t xml:space="preserve"> </w:t>
-      </w:r>
-      <w:r>
-        <w:rPr>
-          <w:sz w:val="26"/>
-          <w:szCs w:val="26"/>
-        </w:rPr>
-        <w:t xml:space="preserve">phase, which then can be relayed to developers who can issue patches. Additionally, </w:t>
-      </w:r>
-      <w:r>
-        <w:rPr>
-          <w:sz w:val="26"/>
-          <w:szCs w:val="26"/>
-        </w:rPr>
-        <w:t xml:space="preserve">the </w:t>
-      </w:r>
-      <w:r>
-        <w:rPr>
-          <w:sz w:val="26"/>
-          <w:szCs w:val="26"/>
-        </w:rPr>
-        <w:t>developer</w:t>
-      </w:r>
-      <w:r>
-        <w:rPr>
-          <w:sz w:val="26"/>
-          <w:szCs w:val="26"/>
-        </w:rPr>
-        <w:t>s</w:t>
-      </w:r>
-      <w:r>
-        <w:rPr>
-          <w:sz w:val="26"/>
-          <w:szCs w:val="26"/>
-        </w:rPr>
-        <w:t xml:space="preserve"> can see the sequence of </w:t>
-      </w:r>
-      <w:r>
-        <w:rPr>
-          <w:sz w:val="26"/>
-          <w:szCs w:val="26"/>
-        </w:rPr>
-        <w:t>behavior</w:t>
-      </w:r>
-      <w:r>
-        <w:rPr>
-          <w:sz w:val="26"/>
-          <w:szCs w:val="26"/>
-        </w:rPr>
-        <w:t xml:space="preserve"> that</w:t>
-      </w:r>
-      <w:r>
-        <w:rPr>
-          <w:sz w:val="26"/>
-          <w:szCs w:val="26"/>
-        </w:rPr>
-        <w:t xml:space="preserve"> leads</w:t>
-      </w:r>
-      <w:r>
-        <w:rPr>
-          <w:sz w:val="26"/>
-          <w:szCs w:val="26"/>
-        </w:rPr>
-        <w:t xml:space="preserve"> the end user to encounter the specific bug.</w:t>
+          <w:lang w:val="en"/>
+        </w:rPr>
+      </w:pPr>
+      <w:r>
+        <w:rPr>
+          <w:b/>
+          <w:sz w:val="26"/>
+          <w:szCs w:val="26"/>
+          <w:lang w:val="en"/>
+        </w:rPr>
+        <w:t xml:space="preserve">Debug Messages: </w:t>
+      </w:r>
+      <w:r>
+        <w:rPr>
+          <w:bCs/>
+          <w:sz w:val="26"/>
+          <w:szCs w:val="26"/>
+          <w:lang w:val="en"/>
+        </w:rPr>
+        <w:t>All actions add a message in the console logs file that is viewable in real-time.</w:t>
+      </w:r>
+    </w:p>
+    <w:p>
+      <w:pPr>
+        <w:rPr>
+          <w:sz w:val="26"/>
+          <w:szCs w:val="26"/>
+          <w:lang w:val="en"/>
+        </w:rPr>
+      </w:pPr>
+    </w:p>
+    <w:p>
+      <w:pPr>
+        <w:rPr>
+          <w:sz w:val="28"/>
+          <w:szCs w:val="28"/>
+          <w:lang w:val="en"/>
+        </w:rPr>
+      </w:pPr>
+      <w:r>
+        <w:rPr>
+          <w:b/>
+          <w:sz w:val="28"/>
+          <w:szCs w:val="28"/>
+          <w:lang w:val="en"/>
+        </w:rPr>
+        <w:t>Implementation and Design Suggestions:</w:t>
+      </w:r>
+    </w:p>
+    <w:p>
+      <w:pPr>
+        <w:numPr>
+          <w:ilvl w:val="1"/>
+          <w:numId w:val="3"/>
+        </w:numPr>
+        <w:rPr>
+          <w:sz w:val="26"/>
+          <w:szCs w:val="26"/>
+          <w:lang w:val="en"/>
+        </w:rPr>
+      </w:pPr>
+      <w:r>
+        <w:rPr>
+          <w:sz w:val="26"/>
+          <w:szCs w:val="26"/>
+          <w:lang w:val="en"/>
+        </w:rPr>
+        <w:t>Debug console UI – setup error codes to be displayed</w:t>
+      </w:r>
+    </w:p>
+    <w:p>
+      <w:pPr>
+        <w:numPr>
+          <w:ilvl w:val="1"/>
+          <w:numId w:val="3"/>
+        </w:numPr>
+        <w:rPr>
+          <w:sz w:val="26"/>
+          <w:szCs w:val="26"/>
+          <w:lang w:val="en"/>
+        </w:rPr>
+      </w:pPr>
+      <w:r>
+        <w:rPr>
+          <w:sz w:val="26"/>
+          <w:szCs w:val="26"/>
+          <w:lang w:val="en"/>
+        </w:rPr>
+        <w:t>All errors trigger an error dialog and prompt the user to the debug console and report the bugs to the developers.</w:t>
+      </w:r>
+    </w:p>
+    <w:p>
+      <w:pPr>
+        <w:numPr>
+          <w:ilvl w:val="1"/>
+          <w:numId w:val="3"/>
+        </w:numPr>
+        <w:rPr>
+          <w:sz w:val="26"/>
+          <w:szCs w:val="26"/>
+          <w:lang w:val="en"/>
+        </w:rPr>
+      </w:pPr>
+      <w:r>
+        <w:rPr>
+          <w:sz w:val="26"/>
+          <w:szCs w:val="26"/>
+          <w:lang w:val="en"/>
+        </w:rPr>
+        <w:t xml:space="preserve">Network team will have to </w:t>
+      </w:r>
+      <w:r>
+        <w:rPr>
+          <w:sz w:val="26"/>
+          <w:szCs w:val="26"/>
+          <w:lang w:val="en"/>
+        </w:rPr>
+        <w:t>set up</w:t>
+      </w:r>
+      <w:r>
+        <w:rPr>
+          <w:sz w:val="26"/>
+          <w:szCs w:val="26"/>
+          <w:lang w:val="en"/>
+        </w:rPr>
+        <w:t xml:space="preserve"> real-time debug log updates on the screen. Preferably the logs are kept on the local machine.</w:t>
       </w:r>
     </w:p>
     <w:sectPr>
@@ -665,11 +1049,315 @@
       </w:pPr>
     </w:lvl>
   </w:abstractNum>
+  <w:abstractNum w:abstractNumId="2" w15:restartNumberingAfterBreak="0">
+    <w:nsid w:val="5BEA779A"/>
+    <w:multiLevelType w:val="multilevel"/>
+    <w:tmpl w:val="49AE1282"/>
+    <w:lvl w:ilvl="0">
+      <w:start w:val="1"/>
+      <w:numFmt w:val="bullet"/>
+      <w:lvlText w:val="●"/>
+      <w:lvlJc w:val="left"/>
+      <w:pPr>
+        <w:ind w:left="720" w:hanging="360"/>
+      </w:pPr>
+      <w:rPr>
+        <w:strike w:val="0"/>
+        <w:dstrike w:val="0"/>
+        <w:u w:val="none"/>
+        <w:effect w:val="none"/>
+      </w:rPr>
+    </w:lvl>
+    <w:lvl w:ilvl="1">
+      <w:start w:val="1"/>
+      <w:numFmt w:val="bullet"/>
+      <w:lvlText w:val="○"/>
+      <w:lvlJc w:val="left"/>
+      <w:pPr>
+        <w:ind w:left="1440" w:hanging="360"/>
+      </w:pPr>
+      <w:rPr>
+        <w:strike w:val="0"/>
+        <w:dstrike w:val="0"/>
+        <w:u w:val="none"/>
+        <w:effect w:val="none"/>
+      </w:rPr>
+    </w:lvl>
+    <w:lvl w:ilvl="2">
+      <w:start w:val="1"/>
+      <w:numFmt w:val="bullet"/>
+      <w:lvlText w:val="■"/>
+      <w:lvlJc w:val="left"/>
+      <w:pPr>
+        <w:ind w:left="2160" w:hanging="360"/>
+      </w:pPr>
+      <w:rPr>
+        <w:strike w:val="0"/>
+        <w:dstrike w:val="0"/>
+        <w:u w:val="none"/>
+        <w:effect w:val="none"/>
+      </w:rPr>
+    </w:lvl>
+    <w:lvl w:ilvl="3">
+      <w:start w:val="1"/>
+      <w:numFmt w:val="bullet"/>
+      <w:lvlText w:val="●"/>
+      <w:lvlJc w:val="left"/>
+      <w:pPr>
+        <w:ind w:left="2880" w:hanging="360"/>
+      </w:pPr>
+      <w:rPr>
+        <w:strike w:val="0"/>
+        <w:dstrike w:val="0"/>
+        <w:u w:val="none"/>
+        <w:effect w:val="none"/>
+      </w:rPr>
+    </w:lvl>
+    <w:lvl w:ilvl="4">
+      <w:start w:val="1"/>
+      <w:numFmt w:val="bullet"/>
+      <w:lvlText w:val="○"/>
+      <w:lvlJc w:val="left"/>
+      <w:pPr>
+        <w:ind w:left="3600" w:hanging="360"/>
+      </w:pPr>
+      <w:rPr>
+        <w:strike w:val="0"/>
+        <w:dstrike w:val="0"/>
+        <w:u w:val="none"/>
+        <w:effect w:val="none"/>
+      </w:rPr>
+    </w:lvl>
+    <w:lvl w:ilvl="5">
+      <w:start w:val="1"/>
+      <w:numFmt w:val="bullet"/>
+      <w:lvlText w:val="■"/>
+      <w:lvlJc w:val="left"/>
+      <w:pPr>
+        <w:ind w:left="4320" w:hanging="360"/>
+      </w:pPr>
+      <w:rPr>
+        <w:strike w:val="0"/>
+        <w:dstrike w:val="0"/>
+        <w:u w:val="none"/>
+        <w:effect w:val="none"/>
+      </w:rPr>
+    </w:lvl>
+    <w:lvl w:ilvl="6">
+      <w:start w:val="1"/>
+      <w:numFmt w:val="bullet"/>
+      <w:lvlText w:val="●"/>
+      <w:lvlJc w:val="left"/>
+      <w:pPr>
+        <w:ind w:left="5040" w:hanging="360"/>
+      </w:pPr>
+      <w:rPr>
+        <w:strike w:val="0"/>
+        <w:dstrike w:val="0"/>
+        <w:u w:val="none"/>
+        <w:effect w:val="none"/>
+      </w:rPr>
+    </w:lvl>
+    <w:lvl w:ilvl="7">
+      <w:start w:val="1"/>
+      <w:numFmt w:val="bullet"/>
+      <w:lvlText w:val="○"/>
+      <w:lvlJc w:val="left"/>
+      <w:pPr>
+        <w:ind w:left="5760" w:hanging="360"/>
+      </w:pPr>
+      <w:rPr>
+        <w:strike w:val="0"/>
+        <w:dstrike w:val="0"/>
+        <w:u w:val="none"/>
+        <w:effect w:val="none"/>
+      </w:rPr>
+    </w:lvl>
+    <w:lvl w:ilvl="8">
+      <w:start w:val="1"/>
+      <w:numFmt w:val="bullet"/>
+      <w:lvlText w:val="■"/>
+      <w:lvlJc w:val="left"/>
+      <w:pPr>
+        <w:ind w:left="6480" w:hanging="360"/>
+      </w:pPr>
+      <w:rPr>
+        <w:strike w:val="0"/>
+        <w:dstrike w:val="0"/>
+        <w:u w:val="none"/>
+        <w:effect w:val="none"/>
+      </w:rPr>
+    </w:lvl>
+  </w:abstractNum>
+  <w:abstractNum w:abstractNumId="3" w15:restartNumberingAfterBreak="0">
+    <w:nsid w:val="79C42566"/>
+    <w:multiLevelType w:val="multilevel"/>
+    <w:tmpl w:val="049AE8E6"/>
+    <w:lvl w:ilvl="0">
+      <w:start w:val="1"/>
+      <w:numFmt w:val="bullet"/>
+      <w:lvlText w:val="●"/>
+      <w:lvlJc w:val="left"/>
+      <w:pPr>
+        <w:ind w:left="720" w:hanging="360"/>
+      </w:pPr>
+      <w:rPr>
+        <w:strike w:val="0"/>
+        <w:dstrike w:val="0"/>
+        <w:u w:val="none"/>
+        <w:effect w:val="none"/>
+      </w:rPr>
+    </w:lvl>
+    <w:lvl w:ilvl="1">
+      <w:start w:val="1"/>
+      <w:numFmt w:val="bullet"/>
+      <w:lvlText w:val="○"/>
+      <w:lvlJc w:val="left"/>
+      <w:pPr>
+        <w:ind w:left="1440" w:hanging="360"/>
+      </w:pPr>
+      <w:rPr>
+        <w:strike w:val="0"/>
+        <w:dstrike w:val="0"/>
+        <w:u w:val="none"/>
+        <w:effect w:val="none"/>
+      </w:rPr>
+    </w:lvl>
+    <w:lvl w:ilvl="2">
+      <w:start w:val="1"/>
+      <w:numFmt w:val="bullet"/>
+      <w:lvlText w:val="■"/>
+      <w:lvlJc w:val="left"/>
+      <w:pPr>
+        <w:ind w:left="2160" w:hanging="360"/>
+      </w:pPr>
+      <w:rPr>
+        <w:strike w:val="0"/>
+        <w:dstrike w:val="0"/>
+        <w:u w:val="none"/>
+        <w:effect w:val="none"/>
+      </w:rPr>
+    </w:lvl>
+    <w:lvl w:ilvl="3">
+      <w:start w:val="1"/>
+      <w:numFmt w:val="bullet"/>
+      <w:lvlText w:val="●"/>
+      <w:lvlJc w:val="left"/>
+      <w:pPr>
+        <w:ind w:left="2880" w:hanging="360"/>
+      </w:pPr>
+      <w:rPr>
+        <w:strike w:val="0"/>
+        <w:dstrike w:val="0"/>
+        <w:u w:val="none"/>
+        <w:effect w:val="none"/>
+      </w:rPr>
+    </w:lvl>
+    <w:lvl w:ilvl="4">
+      <w:start w:val="1"/>
+      <w:numFmt w:val="bullet"/>
+      <w:lvlText w:val="○"/>
+      <w:lvlJc w:val="left"/>
+      <w:pPr>
+        <w:ind w:left="3600" w:hanging="360"/>
+      </w:pPr>
+      <w:rPr>
+        <w:strike w:val="0"/>
+        <w:dstrike w:val="0"/>
+        <w:u w:val="none"/>
+        <w:effect w:val="none"/>
+      </w:rPr>
+    </w:lvl>
+    <w:lvl w:ilvl="5">
+      <w:start w:val="1"/>
+      <w:numFmt w:val="bullet"/>
+      <w:lvlText w:val="■"/>
+      <w:lvlJc w:val="left"/>
+      <w:pPr>
+        <w:ind w:left="4320" w:hanging="360"/>
+      </w:pPr>
+      <w:rPr>
+        <w:strike w:val="0"/>
+        <w:dstrike w:val="0"/>
+        <w:u w:val="none"/>
+        <w:effect w:val="none"/>
+      </w:rPr>
+    </w:lvl>
+    <w:lvl w:ilvl="6">
+      <w:start w:val="1"/>
+      <w:numFmt w:val="bullet"/>
+      <w:lvlText w:val="●"/>
+      <w:lvlJc w:val="left"/>
+      <w:pPr>
+        <w:ind w:left="5040" w:hanging="360"/>
+      </w:pPr>
+      <w:rPr>
+        <w:strike w:val="0"/>
+        <w:dstrike w:val="0"/>
+        <w:u w:val="none"/>
+        <w:effect w:val="none"/>
+      </w:rPr>
+    </w:lvl>
+    <w:lvl w:ilvl="7">
+      <w:start w:val="1"/>
+      <w:numFmt w:val="bullet"/>
+      <w:lvlText w:val="○"/>
+      <w:lvlJc w:val="left"/>
+      <w:pPr>
+        <w:ind w:left="5760" w:hanging="360"/>
+      </w:pPr>
+      <w:rPr>
+        <w:strike w:val="0"/>
+        <w:dstrike w:val="0"/>
+        <w:u w:val="none"/>
+        <w:effect w:val="none"/>
+      </w:rPr>
+    </w:lvl>
+    <w:lvl w:ilvl="8">
+      <w:start w:val="1"/>
+      <w:numFmt w:val="bullet"/>
+      <w:lvlText w:val="■"/>
+      <w:lvlJc w:val="left"/>
+      <w:pPr>
+        <w:ind w:left="6480" w:hanging="360"/>
+      </w:pPr>
+      <w:rPr>
+        <w:strike w:val="0"/>
+        <w:dstrike w:val="0"/>
+        <w:u w:val="none"/>
+        <w:effect w:val="none"/>
+      </w:rPr>
+    </w:lvl>
+  </w:abstractNum>
   <w:num w:numId="1" w16cid:durableId="1324771308">
     <w:abstractNumId w:val="1"/>
   </w:num>
   <w:num w:numId="2" w16cid:durableId="1973054631">
     <w:abstractNumId w:val="0"/>
+  </w:num>
+  <w:num w:numId="3" w16cid:durableId="1313364786">
+    <w:abstractNumId w:val="2"/>
+    <w:lvlOverride w:ilvl="0"/>
+    <w:lvlOverride w:ilvl="1"/>
+    <w:lvlOverride w:ilvl="2"/>
+    <w:lvlOverride w:ilvl="3"/>
+    <w:lvlOverride w:ilvl="4"/>
+    <w:lvlOverride w:ilvl="5"/>
+    <w:lvlOverride w:ilvl="6"/>
+    <w:lvlOverride w:ilvl="7"/>
+    <w:lvlOverride w:ilvl="8"/>
+  </w:num>
+  <w:num w:numId="4" w16cid:durableId="814639663">
+    <w:abstractNumId w:val="3"/>
+    <w:lvlOverride w:ilvl="0"/>
+    <w:lvlOverride w:ilvl="1"/>
+    <w:lvlOverride w:ilvl="2"/>
+    <w:lvlOverride w:ilvl="3"/>
+    <w:lvlOverride w:ilvl="4"/>
+    <w:lvlOverride w:ilvl="5"/>
+    <w:lvlOverride w:ilvl="6"/>
+    <w:lvlOverride w:ilvl="7"/>
+    <w:lvlOverride w:ilvl="8"/>
   </w:num>
 </w:numbering>
 </file>
@@ -1074,6 +1762,7 @@
   <w:style w:type="paragraph" w:default="1" w:styleId="Normal">
     <w:name w:val="Normal"/>
     <w:qFormat/>
+    <w:rsid w:val="00A25F3D"/>
   </w:style>
   <w:style w:type="paragraph" w:styleId="Heading1">
     <w:name w:val="heading 1"/>
@@ -1277,7 +1966,6 @@
   <w:style w:type="character" w:default="1" w:styleId="DefaultParagraphFont">
     <w:name w:val="Default Paragraph Font"/>
     <w:uiPriority w:val="1"/>
-    <w:semiHidden/>
     <w:unhideWhenUsed/>
   </w:style>
   <w:style w:type="table" w:default="1" w:styleId="TableNormal">

</xml_diff>

<commit_message>
updated features in Echo
</commit_message>
<xml_diff>
--- a/Iteration_2/Echo_Review/final_submission/feature_proposal.docx
+++ b/Iteration_2/Echo_Review/final_submission/feature_proposal.docx
@@ -4,11 +4,12 @@
   <w:body>
     <w:p>
       <w:pPr>
+        <w:jc w:val="center"/>
         <w:rPr>
           <w:b/>
           <w:bCs/>
-          <w:sz w:val="34"/>
-          <w:szCs w:val="34"/>
+          <w:sz w:val="36"/>
+          <w:szCs w:val="36"/>
           <w:u w:val="thick"/>
         </w:rPr>
       </w:pPr>
@@ -16,8 +17,8 @@
         <w:rPr>
           <w:b/>
           <w:bCs/>
-          <w:sz w:val="34"/>
-          <w:szCs w:val="34"/>
+          <w:sz w:val="36"/>
+          <w:szCs w:val="36"/>
           <w:u w:val="thick"/>
         </w:rPr>
         <w:t>Feature Proposals for Echo</w:t>
@@ -25,117 +26,127 @@
     </w:p>
     <w:p>
       <w:pPr>
-        <w:pStyle w:val="ListParagraph"/>
-        <w:numPr>
-          <w:ilvl w:val="0"/>
-          <w:numId w:val="2"/>
-        </w:numPr>
-        <w:rPr>
+        <w:rPr>
+          <w:b/>
+          <w:bCs/>
+          <w:sz w:val="30"/>
+          <w:szCs w:val="30"/>
+          <w:u w:val="single"/>
+        </w:rPr>
+      </w:pPr>
+    </w:p>
+    <w:p>
+      <w:pPr>
+        <w:rPr>
+          <w:b/>
+          <w:bCs/>
+          <w:sz w:val="30"/>
+          <w:szCs w:val="30"/>
+          <w:u w:val="single"/>
+        </w:rPr>
+      </w:pPr>
+      <w:r>
+        <w:rPr>
+          <w:b/>
+          <w:bCs/>
+          <w:sz w:val="30"/>
+          <w:szCs w:val="30"/>
+          <w:u w:val="single"/>
+        </w:rPr>
+        <w:t>Feature 1: Move Timers and Resignation</w:t>
+      </w:r>
+    </w:p>
+    <w:p>
+      <w:pPr>
+        <w:rPr>
+          <w:b/>
+          <w:bCs/>
           <w:sz w:val="28"/>
           <w:szCs w:val="28"/>
         </w:rPr>
       </w:pPr>
       <w:r>
         <w:rPr>
-          <w:sz w:val="26"/>
-          <w:szCs w:val="26"/>
-        </w:rPr>
-        <w:t xml:space="preserve">The first feature </w:t>
-      </w:r>
-      <w:r>
-        <w:rPr>
-          <w:sz w:val="26"/>
-          <w:szCs w:val="26"/>
-        </w:rPr>
-        <w:t>we propose is adding</w:t>
-      </w:r>
-      <w:r>
-        <w:rPr>
-          <w:sz w:val="26"/>
-          <w:szCs w:val="26"/>
-        </w:rPr>
-        <w:t xml:space="preserve"> a timer </w:t>
-      </w:r>
-      <w:r>
-        <w:rPr>
-          <w:sz w:val="26"/>
-          <w:szCs w:val="26"/>
-        </w:rPr>
-        <w:t>for the game sessions. This will ensure that if a player leaves in between, the 2</w:t>
-      </w:r>
-      <w:r>
-        <w:rPr>
-          <w:sz w:val="26"/>
-          <w:szCs w:val="26"/>
-          <w:vertAlign w:val="superscript"/>
-        </w:rPr>
-        <w:t>nd</w:t>
-      </w:r>
-      <w:r>
-        <w:rPr>
-          <w:sz w:val="26"/>
-          <w:szCs w:val="26"/>
-        </w:rPr>
-        <w:t xml:space="preserve"> player is not left waiting for the 1</w:t>
-      </w:r>
-      <w:r>
-        <w:rPr>
-          <w:sz w:val="26"/>
-          <w:szCs w:val="26"/>
-          <w:vertAlign w:val="superscript"/>
-        </w:rPr>
-        <w:t>st</w:t>
-      </w:r>
-      <w:r>
-        <w:rPr>
-          <w:sz w:val="26"/>
-          <w:szCs w:val="26"/>
-        </w:rPr>
-        <w:t xml:space="preserve"> player to move. Moreover, if the move timer runs out for any player, the game is automatically forfeited for that player, and the other player wins because of the timeout. Additionally, the skill-based </w:t>
-      </w:r>
-      <w:proofErr w:type="gramStart"/>
-      <w:r>
-        <w:rPr>
-          <w:sz w:val="26"/>
-          <w:szCs w:val="26"/>
-        </w:rPr>
-        <w:t>match-making</w:t>
-      </w:r>
-      <w:proofErr w:type="gramEnd"/>
-      <w:r>
-        <w:rPr>
-          <w:sz w:val="26"/>
-          <w:szCs w:val="26"/>
-        </w:rPr>
-        <w:t xml:space="preserve"> </w:t>
-      </w:r>
-      <w:r>
-        <w:rPr>
-          <w:sz w:val="26"/>
-          <w:szCs w:val="26"/>
-        </w:rPr>
-        <w:t>(</w:t>
-      </w:r>
-      <w:r>
-        <w:rPr>
+          <w:b/>
+          <w:bCs/>
           <w:sz w:val="28"/>
           <w:szCs w:val="28"/>
         </w:rPr>
-        <w:t>SBMM</w:t>
-      </w:r>
-      <w:r>
+        <w:t>Description:</w:t>
+      </w:r>
+    </w:p>
+    <w:p>
+      <w:pPr>
+        <w:pStyle w:val="ListParagraph"/>
         <w:rPr>
           <w:sz w:val="28"/>
           <w:szCs w:val="28"/>
         </w:rPr>
-        <w:t xml:space="preserve">) </w:t>
-      </w:r>
-      <w:r>
-        <w:rPr>
-          <w:sz w:val="26"/>
-          <w:szCs w:val="26"/>
-        </w:rPr>
-        <w:t>process should compensate for this. In addition, a resign button can be added that can allow any player to leave in between or exit the game in between. This will affect the ratings on the leaderboard as well so the match-making process should account for this.</w:t>
+      </w:pPr>
+      <w:r>
+        <w:rPr>
+          <w:sz w:val="26"/>
+          <w:szCs w:val="26"/>
+        </w:rPr>
+        <w:t xml:space="preserve">The first feature </w:t>
+      </w:r>
+      <w:r>
+        <w:rPr>
+          <w:sz w:val="26"/>
+          <w:szCs w:val="26"/>
+        </w:rPr>
+        <w:t>we propose is adding</w:t>
+      </w:r>
+      <w:r>
+        <w:rPr>
+          <w:sz w:val="26"/>
+          <w:szCs w:val="26"/>
+        </w:rPr>
+        <w:t xml:space="preserve"> a timer </w:t>
+      </w:r>
+      <w:r>
+        <w:rPr>
+          <w:sz w:val="26"/>
+          <w:szCs w:val="26"/>
+        </w:rPr>
+        <w:t>for the game sessions. This will ensure that if a player leaves in between, the 2</w:t>
+      </w:r>
+      <w:r>
+        <w:rPr>
+          <w:sz w:val="26"/>
+          <w:szCs w:val="26"/>
+          <w:vertAlign w:val="superscript"/>
+        </w:rPr>
+        <w:t>nd</w:t>
+      </w:r>
+      <w:r>
+        <w:rPr>
+          <w:sz w:val="26"/>
+          <w:szCs w:val="26"/>
+        </w:rPr>
+        <w:t xml:space="preserve"> player is not left waiting for the 1</w:t>
+      </w:r>
+      <w:r>
+        <w:rPr>
+          <w:sz w:val="26"/>
+          <w:szCs w:val="26"/>
+          <w:vertAlign w:val="superscript"/>
+        </w:rPr>
+        <w:t>st</w:t>
+      </w:r>
+      <w:r>
+        <w:rPr>
+          <w:sz w:val="26"/>
+          <w:szCs w:val="26"/>
+        </w:rPr>
+        <w:t xml:space="preserve"> player to move. Moreover, if the move timer runs out for any player, the game is automatically forfeited for that player, and the other player wins because of the timeout. Additionally, the skill-based </w:t>
+      </w:r>
+      <w:r>
+        <w:rPr>
+          <w:sz w:val="26"/>
+          <w:szCs w:val="26"/>
+        </w:rPr>
+        <w:t>matchmaking</w:t>
       </w:r>
       <w:r>
         <w:rPr>
@@ -143,49 +154,426 @@
           <w:szCs w:val="26"/>
         </w:rPr>
         <w:t xml:space="preserve"> </w:t>
+      </w:r>
+      <w:r>
+        <w:rPr>
+          <w:sz w:val="26"/>
+          <w:szCs w:val="26"/>
+        </w:rPr>
+        <w:t>(</w:t>
       </w:r>
       <w:r>
         <w:rPr>
           <w:sz w:val="28"/>
           <w:szCs w:val="28"/>
         </w:rPr>
-        <w:t>Use resignations as loss count to be used in calculating rating points for SBMM</w:t>
+        <w:t>SBMM</w:t>
       </w:r>
       <w:r>
         <w:rPr>
           <w:sz w:val="28"/>
           <w:szCs w:val="28"/>
         </w:rPr>
-        <w:t>.</w:t>
-      </w:r>
-    </w:p>
-    <w:p>
-      <w:pPr>
-        <w:pStyle w:val="ListParagraph"/>
+        <w:t xml:space="preserve">) </w:t>
+      </w:r>
+      <w:r>
+        <w:rPr>
+          <w:sz w:val="26"/>
+          <w:szCs w:val="26"/>
+        </w:rPr>
+        <w:t>process should compensate for this. In addition, a resign button can be added that can allow any player to leave in between or exit the game in between. This will affect the ratings on the leaderboard as well so the match-making process should account for this.</w:t>
+      </w:r>
+      <w:r>
+        <w:rPr>
+          <w:sz w:val="26"/>
+          <w:szCs w:val="26"/>
+        </w:rPr>
+        <w:t xml:space="preserve"> </w:t>
+      </w:r>
+      <w:r>
         <w:rPr>
           <w:sz w:val="28"/>
           <w:szCs w:val="28"/>
         </w:rPr>
-      </w:pPr>
+        <w:t>Use resignations as loss count to be used in calculating rating points for SBMM</w:t>
+      </w:r>
+      <w:r>
+        <w:rPr>
+          <w:sz w:val="28"/>
+          <w:szCs w:val="28"/>
+        </w:rPr>
+        <w:t>.</w:t>
+      </w:r>
     </w:p>
     <w:p>
       <w:pPr>
         <w:pStyle w:val="ListParagraph"/>
+        <w:rPr>
+          <w:sz w:val="28"/>
+          <w:szCs w:val="28"/>
+        </w:rPr>
+      </w:pPr>
+    </w:p>
+    <w:p>
+      <w:pPr>
+        <w:rPr>
+          <w:b/>
+          <w:bCs/>
+          <w:sz w:val="28"/>
+          <w:szCs w:val="28"/>
+        </w:rPr>
+      </w:pPr>
+      <w:r>
+        <w:rPr>
+          <w:b/>
+          <w:bCs/>
+          <w:sz w:val="28"/>
+          <w:szCs w:val="28"/>
+        </w:rPr>
+        <w:t>Impacts to the System:</w:t>
+      </w:r>
+    </w:p>
+    <w:p>
+      <w:pPr>
         <w:numPr>
-          <w:ilvl w:val="0"/>
-          <w:numId w:val="2"/>
+          <w:ilvl w:val="1"/>
+          <w:numId w:val="3"/>
         </w:numPr>
         <w:rPr>
           <w:sz w:val="26"/>
           <w:szCs w:val="26"/>
-        </w:rPr>
-      </w:pPr>
-      <w:r>
-        <w:rPr>
-          <w:sz w:val="26"/>
-          <w:szCs w:val="26"/>
-        </w:rPr>
-        <w:t>Since the group is working on multiple clients connecting to a server, you could</w:t>
+          <w:lang w:val="en"/>
+        </w:rPr>
+      </w:pPr>
+      <w:r>
+        <w:rPr>
+          <w:b/>
+          <w:sz w:val="26"/>
+          <w:szCs w:val="26"/>
+          <w:lang w:val="en"/>
+        </w:rPr>
+        <w:t>Session Ends</w:t>
+      </w:r>
+      <w:r>
+        <w:rPr>
+          <w:b/>
+          <w:sz w:val="26"/>
+          <w:szCs w:val="26"/>
+          <w:lang w:val="en"/>
+        </w:rPr>
+        <w:t xml:space="preserve">: </w:t>
+      </w:r>
+      <w:r>
+        <w:rPr>
+          <w:bCs/>
+          <w:sz w:val="26"/>
+          <w:szCs w:val="26"/>
+          <w:lang w:val="en"/>
+        </w:rPr>
+        <w:t>If the timer runs out or the player resigns, end the game session and bring it back to the home screen with a pop-up for the updated ratings</w:t>
+      </w:r>
+      <w:r>
+        <w:rPr>
+          <w:sz w:val="26"/>
+          <w:szCs w:val="26"/>
+          <w:lang w:val="en"/>
+        </w:rPr>
+        <w:t>.</w:t>
+      </w:r>
+    </w:p>
+    <w:p>
+      <w:pPr>
+        <w:numPr>
+          <w:ilvl w:val="1"/>
+          <w:numId w:val="3"/>
+        </w:numPr>
+        <w:rPr>
+          <w:sz w:val="26"/>
+          <w:szCs w:val="26"/>
+          <w:lang w:val="en"/>
+        </w:rPr>
+      </w:pPr>
+      <w:r>
+        <w:rPr>
+          <w:b/>
+          <w:sz w:val="26"/>
+          <w:szCs w:val="26"/>
+          <w:lang w:val="en"/>
+        </w:rPr>
+        <w:t xml:space="preserve">Notification System: </w:t>
+      </w:r>
+      <w:r>
+        <w:rPr>
+          <w:sz w:val="26"/>
+          <w:szCs w:val="26"/>
+          <w:lang w:val="en"/>
+        </w:rPr>
+        <w:t>Notification to the user that time is running out. Confirmation to the user if they want to resign.</w:t>
+      </w:r>
+    </w:p>
+    <w:p>
+      <w:pPr>
+        <w:ind w:left="1440"/>
+        <w:rPr>
+          <w:sz w:val="26"/>
+          <w:szCs w:val="26"/>
+          <w:lang w:val="en"/>
+        </w:rPr>
+      </w:pPr>
+    </w:p>
+    <w:p>
+      <w:pPr>
+        <w:rPr>
+          <w:sz w:val="28"/>
+          <w:szCs w:val="28"/>
+          <w:lang w:val="en"/>
+        </w:rPr>
+      </w:pPr>
+      <w:r>
+        <w:rPr>
+          <w:b/>
+          <w:sz w:val="28"/>
+          <w:szCs w:val="28"/>
+          <w:lang w:val="en"/>
+        </w:rPr>
+        <w:t>Implementation and Design Suggestions:</w:t>
+      </w:r>
+    </w:p>
+    <w:p>
+      <w:pPr>
+        <w:numPr>
+          <w:ilvl w:val="1"/>
+          <w:numId w:val="3"/>
+        </w:numPr>
+        <w:rPr>
+          <w:sz w:val="26"/>
+          <w:szCs w:val="26"/>
+          <w:lang w:val="en"/>
+        </w:rPr>
+      </w:pPr>
+      <w:r>
+        <w:rPr>
+          <w:sz w:val="26"/>
+          <w:szCs w:val="26"/>
+          <w:lang w:val="en"/>
+        </w:rPr>
+        <w:t>Add a move timer in the UI</w:t>
+      </w:r>
+    </w:p>
+    <w:p>
+      <w:pPr>
+        <w:numPr>
+          <w:ilvl w:val="1"/>
+          <w:numId w:val="3"/>
+        </w:numPr>
+        <w:rPr>
+          <w:sz w:val="26"/>
+          <w:szCs w:val="26"/>
+          <w:lang w:val="en"/>
+        </w:rPr>
+      </w:pPr>
+      <w:r>
+        <w:rPr>
+          <w:sz w:val="26"/>
+          <w:szCs w:val="26"/>
+          <w:lang w:val="en"/>
+        </w:rPr>
+        <w:t>Add resign button</w:t>
+      </w:r>
+    </w:p>
+    <w:p>
+      <w:pPr>
+        <w:numPr>
+          <w:ilvl w:val="1"/>
+          <w:numId w:val="3"/>
+        </w:numPr>
+        <w:rPr>
+          <w:sz w:val="26"/>
+          <w:szCs w:val="26"/>
+          <w:lang w:val="en"/>
+        </w:rPr>
+      </w:pPr>
+      <w:r>
+        <w:rPr>
+          <w:sz w:val="26"/>
+          <w:szCs w:val="26"/>
+          <w:lang w:val="en"/>
+        </w:rPr>
+        <w:t>Make a function that connects the user resignation to ratings and updates the leader board.</w:t>
+      </w:r>
+    </w:p>
+    <w:p>
+      <w:pPr>
+        <w:rPr>
+          <w:sz w:val="26"/>
+          <w:szCs w:val="26"/>
+          <w:lang w:val="en"/>
+        </w:rPr>
+      </w:pPr>
+    </w:p>
+    <w:p>
+      <w:pPr>
+        <w:rPr>
+          <w:sz w:val="28"/>
+          <w:szCs w:val="28"/>
+        </w:rPr>
+      </w:pPr>
+    </w:p>
+    <w:p>
+      <w:pPr>
+        <w:rPr>
+          <w:b/>
+          <w:bCs/>
+          <w:sz w:val="30"/>
+          <w:szCs w:val="30"/>
+          <w:u w:val="single"/>
+        </w:rPr>
+      </w:pPr>
+      <w:r>
+        <w:rPr>
+          <w:b/>
+          <w:bCs/>
+          <w:sz w:val="30"/>
+          <w:szCs w:val="30"/>
+          <w:u w:val="single"/>
+        </w:rPr>
+        <w:lastRenderedPageBreak/>
+        <w:t xml:space="preserve">Feature </w:t>
+      </w:r>
+      <w:r>
+        <w:rPr>
+          <w:b/>
+          <w:bCs/>
+          <w:sz w:val="30"/>
+          <w:szCs w:val="30"/>
+          <w:u w:val="single"/>
+        </w:rPr>
+        <w:t>2</w:t>
+      </w:r>
+      <w:r>
+        <w:rPr>
+          <w:b/>
+          <w:bCs/>
+          <w:sz w:val="30"/>
+          <w:szCs w:val="30"/>
+          <w:u w:val="single"/>
+        </w:rPr>
+        <w:t>:</w:t>
+      </w:r>
+      <w:r>
+        <w:rPr>
+          <w:b/>
+          <w:bCs/>
+          <w:sz w:val="30"/>
+          <w:szCs w:val="30"/>
+          <w:u w:val="single"/>
+        </w:rPr>
+        <w:t xml:space="preserve"> Debug Console</w:t>
+      </w:r>
+    </w:p>
+    <w:p>
+      <w:pPr>
+        <w:rPr>
+          <w:b/>
+          <w:bCs/>
+          <w:sz w:val="28"/>
+          <w:szCs w:val="28"/>
+        </w:rPr>
+      </w:pPr>
+      <w:r>
+        <w:rPr>
+          <w:b/>
+          <w:bCs/>
+          <w:sz w:val="28"/>
+          <w:szCs w:val="28"/>
+        </w:rPr>
+        <w:t>Description:</w:t>
+      </w:r>
+    </w:p>
+    <w:p>
+      <w:pPr>
+        <w:pStyle w:val="ListParagraph"/>
+        <w:rPr>
+          <w:sz w:val="26"/>
+          <w:szCs w:val="26"/>
+        </w:rPr>
+      </w:pPr>
+      <w:r>
+        <w:rPr>
+          <w:sz w:val="26"/>
+          <w:szCs w:val="26"/>
+        </w:rPr>
+        <w:t>Adding a debug console can be beneficial for not only the developers but also the users as</w:t>
+      </w:r>
+      <w:r>
+        <w:rPr>
+          <w:sz w:val="26"/>
+          <w:szCs w:val="26"/>
+        </w:rPr>
+        <w:t xml:space="preserve"> s</w:t>
+      </w:r>
+      <w:r>
+        <w:rPr>
+          <w:sz w:val="26"/>
+          <w:szCs w:val="26"/>
+        </w:rPr>
+        <w:t xml:space="preserve">pecific error logging </w:t>
+      </w:r>
+      <w:r>
+        <w:rPr>
+          <w:sz w:val="26"/>
+          <w:szCs w:val="26"/>
+        </w:rPr>
+        <w:t>can ensure</w:t>
+      </w:r>
+      <w:r>
+        <w:rPr>
+          <w:sz w:val="26"/>
+          <w:szCs w:val="26"/>
+        </w:rPr>
+        <w:t xml:space="preserve"> that the end user </w:t>
+      </w:r>
+      <w:r>
+        <w:rPr>
+          <w:sz w:val="26"/>
+          <w:szCs w:val="26"/>
+        </w:rPr>
+        <w:t>can</w:t>
+      </w:r>
+      <w:r>
+        <w:rPr>
+          <w:sz w:val="26"/>
+          <w:szCs w:val="26"/>
+        </w:rPr>
+        <w:t xml:space="preserve"> report issues that may have </w:t>
+      </w:r>
+      <w:r>
+        <w:rPr>
+          <w:sz w:val="26"/>
+          <w:szCs w:val="26"/>
+        </w:rPr>
+        <w:t xml:space="preserve">been </w:t>
+      </w:r>
+      <w:r>
+        <w:rPr>
+          <w:sz w:val="26"/>
+          <w:szCs w:val="26"/>
+        </w:rPr>
+        <w:t xml:space="preserve">skipped </w:t>
+      </w:r>
+      <w:r>
+        <w:rPr>
+          <w:sz w:val="26"/>
+          <w:szCs w:val="26"/>
+        </w:rPr>
+        <w:t xml:space="preserve">in the </w:t>
+      </w:r>
+      <w:r>
+        <w:rPr>
+          <w:sz w:val="26"/>
+          <w:szCs w:val="26"/>
+        </w:rPr>
+        <w:t>testing</w:t>
       </w:r>
       <w:r>
         <w:rPr>
@@ -199,63 +587,63 @@
           <w:sz w:val="26"/>
           <w:szCs w:val="26"/>
         </w:rPr>
-        <w:t>use threads or processes to handle each client connection separately. This would</w:t>
-      </w:r>
-      <w:r>
-        <w:rPr>
-          <w:sz w:val="26"/>
-          <w:szCs w:val="26"/>
-        </w:rPr>
-        <w:t xml:space="preserve"> </w:t>
-      </w:r>
-      <w:r>
-        <w:rPr>
-          <w:sz w:val="26"/>
-          <w:szCs w:val="26"/>
-        </w:rPr>
-        <w:t>make the server logic simpler and avoid the need for so many nested loops.</w:t>
-      </w:r>
-      <w:r>
-        <w:rPr>
-          <w:sz w:val="26"/>
-          <w:szCs w:val="26"/>
-        </w:rPr>
-        <w:t xml:space="preserve"> </w:t>
-      </w:r>
-      <w:r>
-        <w:rPr>
-          <w:sz w:val="26"/>
-          <w:szCs w:val="26"/>
-        </w:rPr>
-        <w:t>Another option is to use a singleton class for simplicity, but the current loop</w:t>
-      </w:r>
-      <w:r>
-        <w:rPr>
-          <w:sz w:val="26"/>
-          <w:szCs w:val="26"/>
-        </w:rPr>
-        <w:t xml:space="preserve"> </w:t>
-      </w:r>
-      <w:r>
-        <w:rPr>
-          <w:sz w:val="26"/>
-          <w:szCs w:val="26"/>
-        </w:rPr>
-        <w:t>idea seems tricky to implement and would likely be hard to debug. Switching to</w:t>
-      </w:r>
-      <w:r>
-        <w:rPr>
-          <w:sz w:val="26"/>
-          <w:szCs w:val="26"/>
-        </w:rPr>
-        <w:t xml:space="preserve"> </w:t>
-      </w:r>
-      <w:r>
-        <w:rPr>
-          <w:sz w:val="26"/>
-          <w:szCs w:val="26"/>
-        </w:rPr>
-        <w:t>one of these approaches could make the system much easier to manage.</w:t>
+        <w:t xml:space="preserve">phase, which then can be relayed to developers who can issue patches. Additionally, </w:t>
+      </w:r>
+      <w:r>
+        <w:rPr>
+          <w:sz w:val="26"/>
+          <w:szCs w:val="26"/>
+        </w:rPr>
+        <w:t xml:space="preserve">the </w:t>
+      </w:r>
+      <w:r>
+        <w:rPr>
+          <w:sz w:val="26"/>
+          <w:szCs w:val="26"/>
+        </w:rPr>
+        <w:t>developer</w:t>
+      </w:r>
+      <w:r>
+        <w:rPr>
+          <w:sz w:val="26"/>
+          <w:szCs w:val="26"/>
+        </w:rPr>
+        <w:t>s</w:t>
+      </w:r>
+      <w:r>
+        <w:rPr>
+          <w:sz w:val="26"/>
+          <w:szCs w:val="26"/>
+        </w:rPr>
+        <w:t xml:space="preserve"> can see the sequence of </w:t>
+      </w:r>
+      <w:r>
+        <w:rPr>
+          <w:sz w:val="26"/>
+          <w:szCs w:val="26"/>
+        </w:rPr>
+        <w:t>behavior</w:t>
+      </w:r>
+      <w:r>
+        <w:rPr>
+          <w:sz w:val="26"/>
+          <w:szCs w:val="26"/>
+        </w:rPr>
+        <w:t xml:space="preserve"> that</w:t>
+      </w:r>
+      <w:r>
+        <w:rPr>
+          <w:sz w:val="26"/>
+          <w:szCs w:val="26"/>
+        </w:rPr>
+        <w:t xml:space="preserve"> leads</w:t>
+      </w:r>
+      <w:r>
+        <w:rPr>
+          <w:sz w:val="26"/>
+          <w:szCs w:val="26"/>
+        </w:rPr>
+        <w:t xml:space="preserve"> the end user to encounter the specific bug.</w:t>
       </w:r>
     </w:p>
     <w:p>
@@ -269,162 +657,158 @@
     </w:p>
     <w:p>
       <w:pPr>
-        <w:pStyle w:val="ListParagraph"/>
+        <w:rPr>
+          <w:b/>
+          <w:bCs/>
+          <w:sz w:val="28"/>
+          <w:szCs w:val="28"/>
+        </w:rPr>
+      </w:pPr>
+      <w:r>
+        <w:rPr>
+          <w:b/>
+          <w:bCs/>
+          <w:sz w:val="28"/>
+          <w:szCs w:val="28"/>
+        </w:rPr>
+        <w:t>Impacts to the System:</w:t>
+      </w:r>
+    </w:p>
+    <w:p>
+      <w:pPr>
         <w:numPr>
-          <w:ilvl w:val="0"/>
-          <w:numId w:val="2"/>
+          <w:ilvl w:val="1"/>
+          <w:numId w:val="3"/>
         </w:numPr>
         <w:rPr>
           <w:sz w:val="26"/>
           <w:szCs w:val="26"/>
-        </w:rPr>
-      </w:pPr>
-      <w:r>
-        <w:rPr>
-          <w:sz w:val="26"/>
-          <w:szCs w:val="26"/>
-        </w:rPr>
-        <w:t>Adding a debug console can be beneficial for not only the developers but also the users as</w:t>
-      </w:r>
-      <w:r>
-        <w:rPr>
-          <w:sz w:val="26"/>
-          <w:szCs w:val="26"/>
-        </w:rPr>
-        <w:t xml:space="preserve"> s</w:t>
-      </w:r>
-      <w:r>
-        <w:rPr>
-          <w:sz w:val="26"/>
-          <w:szCs w:val="26"/>
-        </w:rPr>
-        <w:t xml:space="preserve">pecific error logging </w:t>
-      </w:r>
-      <w:r>
-        <w:rPr>
-          <w:sz w:val="26"/>
-          <w:szCs w:val="26"/>
-        </w:rPr>
-        <w:t>can ensure</w:t>
-      </w:r>
-      <w:r>
-        <w:rPr>
-          <w:sz w:val="26"/>
-          <w:szCs w:val="26"/>
-        </w:rPr>
-        <w:t xml:space="preserve"> that the end user </w:t>
-      </w:r>
-      <w:r>
-        <w:rPr>
-          <w:sz w:val="26"/>
-          <w:szCs w:val="26"/>
-        </w:rPr>
-        <w:t>can</w:t>
-      </w:r>
-      <w:r>
-        <w:rPr>
-          <w:sz w:val="26"/>
-          <w:szCs w:val="26"/>
-        </w:rPr>
-        <w:t xml:space="preserve"> report issues that may have </w:t>
-      </w:r>
-      <w:r>
-        <w:rPr>
-          <w:sz w:val="26"/>
-          <w:szCs w:val="26"/>
-        </w:rPr>
-        <w:t xml:space="preserve">been </w:t>
-      </w:r>
-      <w:r>
-        <w:rPr>
-          <w:sz w:val="26"/>
-          <w:szCs w:val="26"/>
-        </w:rPr>
-        <w:t xml:space="preserve">skipped </w:t>
-      </w:r>
-      <w:r>
-        <w:rPr>
-          <w:sz w:val="26"/>
-          <w:szCs w:val="26"/>
-        </w:rPr>
-        <w:t xml:space="preserve">in the </w:t>
-      </w:r>
-      <w:r>
-        <w:rPr>
-          <w:sz w:val="26"/>
-          <w:szCs w:val="26"/>
-        </w:rPr>
-        <w:t>testing</w:t>
-      </w:r>
-      <w:r>
-        <w:rPr>
-          <w:sz w:val="26"/>
-          <w:szCs w:val="26"/>
-        </w:rPr>
-        <w:t xml:space="preserve"> </w:t>
-      </w:r>
-      <w:r>
-        <w:rPr>
-          <w:sz w:val="26"/>
-          <w:szCs w:val="26"/>
-        </w:rPr>
-        <w:t xml:space="preserve">phase, which then can be relayed to developers who can issue patches. Additionally, </w:t>
-      </w:r>
-      <w:r>
-        <w:rPr>
-          <w:sz w:val="26"/>
-          <w:szCs w:val="26"/>
-        </w:rPr>
-        <w:t xml:space="preserve">the </w:t>
-      </w:r>
-      <w:r>
-        <w:rPr>
-          <w:sz w:val="26"/>
-          <w:szCs w:val="26"/>
-        </w:rPr>
-        <w:t>developer</w:t>
-      </w:r>
-      <w:r>
-        <w:rPr>
-          <w:sz w:val="26"/>
-          <w:szCs w:val="26"/>
-        </w:rPr>
-        <w:t>s</w:t>
-      </w:r>
-      <w:r>
-        <w:rPr>
-          <w:sz w:val="26"/>
-          <w:szCs w:val="26"/>
-        </w:rPr>
-        <w:t xml:space="preserve"> can see the sequence of </w:t>
-      </w:r>
-      <w:r>
-        <w:rPr>
-          <w:sz w:val="26"/>
-          <w:szCs w:val="26"/>
-        </w:rPr>
-        <w:t>behavior</w:t>
-      </w:r>
-      <w:r>
-        <w:rPr>
-          <w:sz w:val="26"/>
-          <w:szCs w:val="26"/>
-        </w:rPr>
-        <w:t xml:space="preserve"> that</w:t>
-      </w:r>
-      <w:r>
-        <w:rPr>
-          <w:sz w:val="26"/>
-          <w:szCs w:val="26"/>
-        </w:rPr>
-        <w:t xml:space="preserve"> leads</w:t>
-      </w:r>
-      <w:r>
-        <w:rPr>
-          <w:sz w:val="26"/>
-          <w:szCs w:val="26"/>
-        </w:rPr>
-        <w:t xml:space="preserve"> the end user to encounter the specific bug.</w:t>
+          <w:lang w:val="en"/>
+        </w:rPr>
+      </w:pPr>
+      <w:r>
+        <w:rPr>
+          <w:b/>
+          <w:sz w:val="26"/>
+          <w:szCs w:val="26"/>
+          <w:lang w:val="en"/>
+        </w:rPr>
+        <w:t xml:space="preserve">Debug Messages: </w:t>
+      </w:r>
+      <w:r>
+        <w:rPr>
+          <w:bCs/>
+          <w:sz w:val="26"/>
+          <w:szCs w:val="26"/>
+          <w:lang w:val="en"/>
+        </w:rPr>
+        <w:t>All actions add a message in the console logs file that is viewable in real-time.</w:t>
+      </w:r>
+    </w:p>
+    <w:p>
+      <w:pPr>
+        <w:rPr>
+          <w:sz w:val="26"/>
+          <w:szCs w:val="26"/>
+          <w:lang w:val="en"/>
+        </w:rPr>
+      </w:pPr>
+    </w:p>
+    <w:p>
+      <w:pPr>
+        <w:rPr>
+          <w:sz w:val="28"/>
+          <w:szCs w:val="28"/>
+          <w:lang w:val="en"/>
+        </w:rPr>
+      </w:pPr>
+      <w:r>
+        <w:rPr>
+          <w:b/>
+          <w:sz w:val="28"/>
+          <w:szCs w:val="28"/>
+          <w:lang w:val="en"/>
+        </w:rPr>
+        <w:t>Implementation and Design Suggestions:</w:t>
+      </w:r>
+    </w:p>
+    <w:p>
+      <w:pPr>
+        <w:numPr>
+          <w:ilvl w:val="1"/>
+          <w:numId w:val="3"/>
+        </w:numPr>
+        <w:rPr>
+          <w:sz w:val="26"/>
+          <w:szCs w:val="26"/>
+          <w:lang w:val="en"/>
+        </w:rPr>
+      </w:pPr>
+      <w:r>
+        <w:rPr>
+          <w:sz w:val="26"/>
+          <w:szCs w:val="26"/>
+          <w:lang w:val="en"/>
+        </w:rPr>
+        <w:t>Debug console UI – setup error codes to be displayed</w:t>
+      </w:r>
+    </w:p>
+    <w:p>
+      <w:pPr>
+        <w:numPr>
+          <w:ilvl w:val="1"/>
+          <w:numId w:val="3"/>
+        </w:numPr>
+        <w:rPr>
+          <w:sz w:val="26"/>
+          <w:szCs w:val="26"/>
+          <w:lang w:val="en"/>
+        </w:rPr>
+      </w:pPr>
+      <w:r>
+        <w:rPr>
+          <w:sz w:val="26"/>
+          <w:szCs w:val="26"/>
+          <w:lang w:val="en"/>
+        </w:rPr>
+        <w:t>All errors trigger an error dialog and prompt the user to the debug console and report the bugs to the developers.</w:t>
+      </w:r>
+    </w:p>
+    <w:p>
+      <w:pPr>
+        <w:numPr>
+          <w:ilvl w:val="1"/>
+          <w:numId w:val="3"/>
+        </w:numPr>
+        <w:rPr>
+          <w:sz w:val="26"/>
+          <w:szCs w:val="26"/>
+          <w:lang w:val="en"/>
+        </w:rPr>
+      </w:pPr>
+      <w:r>
+        <w:rPr>
+          <w:sz w:val="26"/>
+          <w:szCs w:val="26"/>
+          <w:lang w:val="en"/>
+        </w:rPr>
+        <w:t xml:space="preserve">Network team will have to </w:t>
+      </w:r>
+      <w:r>
+        <w:rPr>
+          <w:sz w:val="26"/>
+          <w:szCs w:val="26"/>
+          <w:lang w:val="en"/>
+        </w:rPr>
+        <w:t>set up</w:t>
+      </w:r>
+      <w:r>
+        <w:rPr>
+          <w:sz w:val="26"/>
+          <w:szCs w:val="26"/>
+          <w:lang w:val="en"/>
+        </w:rPr>
+        <w:t xml:space="preserve"> real-time debug log updates on the screen. Preferably the logs are kept on the local machine.</w:t>
       </w:r>
     </w:p>
     <w:sectPr>
@@ -665,11 +1049,315 @@
       </w:pPr>
     </w:lvl>
   </w:abstractNum>
+  <w:abstractNum w:abstractNumId="2" w15:restartNumberingAfterBreak="0">
+    <w:nsid w:val="5BEA779A"/>
+    <w:multiLevelType w:val="multilevel"/>
+    <w:tmpl w:val="49AE1282"/>
+    <w:lvl w:ilvl="0">
+      <w:start w:val="1"/>
+      <w:numFmt w:val="bullet"/>
+      <w:lvlText w:val="●"/>
+      <w:lvlJc w:val="left"/>
+      <w:pPr>
+        <w:ind w:left="720" w:hanging="360"/>
+      </w:pPr>
+      <w:rPr>
+        <w:strike w:val="0"/>
+        <w:dstrike w:val="0"/>
+        <w:u w:val="none"/>
+        <w:effect w:val="none"/>
+      </w:rPr>
+    </w:lvl>
+    <w:lvl w:ilvl="1">
+      <w:start w:val="1"/>
+      <w:numFmt w:val="bullet"/>
+      <w:lvlText w:val="○"/>
+      <w:lvlJc w:val="left"/>
+      <w:pPr>
+        <w:ind w:left="1440" w:hanging="360"/>
+      </w:pPr>
+      <w:rPr>
+        <w:strike w:val="0"/>
+        <w:dstrike w:val="0"/>
+        <w:u w:val="none"/>
+        <w:effect w:val="none"/>
+      </w:rPr>
+    </w:lvl>
+    <w:lvl w:ilvl="2">
+      <w:start w:val="1"/>
+      <w:numFmt w:val="bullet"/>
+      <w:lvlText w:val="■"/>
+      <w:lvlJc w:val="left"/>
+      <w:pPr>
+        <w:ind w:left="2160" w:hanging="360"/>
+      </w:pPr>
+      <w:rPr>
+        <w:strike w:val="0"/>
+        <w:dstrike w:val="0"/>
+        <w:u w:val="none"/>
+        <w:effect w:val="none"/>
+      </w:rPr>
+    </w:lvl>
+    <w:lvl w:ilvl="3">
+      <w:start w:val="1"/>
+      <w:numFmt w:val="bullet"/>
+      <w:lvlText w:val="●"/>
+      <w:lvlJc w:val="left"/>
+      <w:pPr>
+        <w:ind w:left="2880" w:hanging="360"/>
+      </w:pPr>
+      <w:rPr>
+        <w:strike w:val="0"/>
+        <w:dstrike w:val="0"/>
+        <w:u w:val="none"/>
+        <w:effect w:val="none"/>
+      </w:rPr>
+    </w:lvl>
+    <w:lvl w:ilvl="4">
+      <w:start w:val="1"/>
+      <w:numFmt w:val="bullet"/>
+      <w:lvlText w:val="○"/>
+      <w:lvlJc w:val="left"/>
+      <w:pPr>
+        <w:ind w:left="3600" w:hanging="360"/>
+      </w:pPr>
+      <w:rPr>
+        <w:strike w:val="0"/>
+        <w:dstrike w:val="0"/>
+        <w:u w:val="none"/>
+        <w:effect w:val="none"/>
+      </w:rPr>
+    </w:lvl>
+    <w:lvl w:ilvl="5">
+      <w:start w:val="1"/>
+      <w:numFmt w:val="bullet"/>
+      <w:lvlText w:val="■"/>
+      <w:lvlJc w:val="left"/>
+      <w:pPr>
+        <w:ind w:left="4320" w:hanging="360"/>
+      </w:pPr>
+      <w:rPr>
+        <w:strike w:val="0"/>
+        <w:dstrike w:val="0"/>
+        <w:u w:val="none"/>
+        <w:effect w:val="none"/>
+      </w:rPr>
+    </w:lvl>
+    <w:lvl w:ilvl="6">
+      <w:start w:val="1"/>
+      <w:numFmt w:val="bullet"/>
+      <w:lvlText w:val="●"/>
+      <w:lvlJc w:val="left"/>
+      <w:pPr>
+        <w:ind w:left="5040" w:hanging="360"/>
+      </w:pPr>
+      <w:rPr>
+        <w:strike w:val="0"/>
+        <w:dstrike w:val="0"/>
+        <w:u w:val="none"/>
+        <w:effect w:val="none"/>
+      </w:rPr>
+    </w:lvl>
+    <w:lvl w:ilvl="7">
+      <w:start w:val="1"/>
+      <w:numFmt w:val="bullet"/>
+      <w:lvlText w:val="○"/>
+      <w:lvlJc w:val="left"/>
+      <w:pPr>
+        <w:ind w:left="5760" w:hanging="360"/>
+      </w:pPr>
+      <w:rPr>
+        <w:strike w:val="0"/>
+        <w:dstrike w:val="0"/>
+        <w:u w:val="none"/>
+        <w:effect w:val="none"/>
+      </w:rPr>
+    </w:lvl>
+    <w:lvl w:ilvl="8">
+      <w:start w:val="1"/>
+      <w:numFmt w:val="bullet"/>
+      <w:lvlText w:val="■"/>
+      <w:lvlJc w:val="left"/>
+      <w:pPr>
+        <w:ind w:left="6480" w:hanging="360"/>
+      </w:pPr>
+      <w:rPr>
+        <w:strike w:val="0"/>
+        <w:dstrike w:val="0"/>
+        <w:u w:val="none"/>
+        <w:effect w:val="none"/>
+      </w:rPr>
+    </w:lvl>
+  </w:abstractNum>
+  <w:abstractNum w:abstractNumId="3" w15:restartNumberingAfterBreak="0">
+    <w:nsid w:val="79C42566"/>
+    <w:multiLevelType w:val="multilevel"/>
+    <w:tmpl w:val="049AE8E6"/>
+    <w:lvl w:ilvl="0">
+      <w:start w:val="1"/>
+      <w:numFmt w:val="bullet"/>
+      <w:lvlText w:val="●"/>
+      <w:lvlJc w:val="left"/>
+      <w:pPr>
+        <w:ind w:left="720" w:hanging="360"/>
+      </w:pPr>
+      <w:rPr>
+        <w:strike w:val="0"/>
+        <w:dstrike w:val="0"/>
+        <w:u w:val="none"/>
+        <w:effect w:val="none"/>
+      </w:rPr>
+    </w:lvl>
+    <w:lvl w:ilvl="1">
+      <w:start w:val="1"/>
+      <w:numFmt w:val="bullet"/>
+      <w:lvlText w:val="○"/>
+      <w:lvlJc w:val="left"/>
+      <w:pPr>
+        <w:ind w:left="1440" w:hanging="360"/>
+      </w:pPr>
+      <w:rPr>
+        <w:strike w:val="0"/>
+        <w:dstrike w:val="0"/>
+        <w:u w:val="none"/>
+        <w:effect w:val="none"/>
+      </w:rPr>
+    </w:lvl>
+    <w:lvl w:ilvl="2">
+      <w:start w:val="1"/>
+      <w:numFmt w:val="bullet"/>
+      <w:lvlText w:val="■"/>
+      <w:lvlJc w:val="left"/>
+      <w:pPr>
+        <w:ind w:left="2160" w:hanging="360"/>
+      </w:pPr>
+      <w:rPr>
+        <w:strike w:val="0"/>
+        <w:dstrike w:val="0"/>
+        <w:u w:val="none"/>
+        <w:effect w:val="none"/>
+      </w:rPr>
+    </w:lvl>
+    <w:lvl w:ilvl="3">
+      <w:start w:val="1"/>
+      <w:numFmt w:val="bullet"/>
+      <w:lvlText w:val="●"/>
+      <w:lvlJc w:val="left"/>
+      <w:pPr>
+        <w:ind w:left="2880" w:hanging="360"/>
+      </w:pPr>
+      <w:rPr>
+        <w:strike w:val="0"/>
+        <w:dstrike w:val="0"/>
+        <w:u w:val="none"/>
+        <w:effect w:val="none"/>
+      </w:rPr>
+    </w:lvl>
+    <w:lvl w:ilvl="4">
+      <w:start w:val="1"/>
+      <w:numFmt w:val="bullet"/>
+      <w:lvlText w:val="○"/>
+      <w:lvlJc w:val="left"/>
+      <w:pPr>
+        <w:ind w:left="3600" w:hanging="360"/>
+      </w:pPr>
+      <w:rPr>
+        <w:strike w:val="0"/>
+        <w:dstrike w:val="0"/>
+        <w:u w:val="none"/>
+        <w:effect w:val="none"/>
+      </w:rPr>
+    </w:lvl>
+    <w:lvl w:ilvl="5">
+      <w:start w:val="1"/>
+      <w:numFmt w:val="bullet"/>
+      <w:lvlText w:val="■"/>
+      <w:lvlJc w:val="left"/>
+      <w:pPr>
+        <w:ind w:left="4320" w:hanging="360"/>
+      </w:pPr>
+      <w:rPr>
+        <w:strike w:val="0"/>
+        <w:dstrike w:val="0"/>
+        <w:u w:val="none"/>
+        <w:effect w:val="none"/>
+      </w:rPr>
+    </w:lvl>
+    <w:lvl w:ilvl="6">
+      <w:start w:val="1"/>
+      <w:numFmt w:val="bullet"/>
+      <w:lvlText w:val="●"/>
+      <w:lvlJc w:val="left"/>
+      <w:pPr>
+        <w:ind w:left="5040" w:hanging="360"/>
+      </w:pPr>
+      <w:rPr>
+        <w:strike w:val="0"/>
+        <w:dstrike w:val="0"/>
+        <w:u w:val="none"/>
+        <w:effect w:val="none"/>
+      </w:rPr>
+    </w:lvl>
+    <w:lvl w:ilvl="7">
+      <w:start w:val="1"/>
+      <w:numFmt w:val="bullet"/>
+      <w:lvlText w:val="○"/>
+      <w:lvlJc w:val="left"/>
+      <w:pPr>
+        <w:ind w:left="5760" w:hanging="360"/>
+      </w:pPr>
+      <w:rPr>
+        <w:strike w:val="0"/>
+        <w:dstrike w:val="0"/>
+        <w:u w:val="none"/>
+        <w:effect w:val="none"/>
+      </w:rPr>
+    </w:lvl>
+    <w:lvl w:ilvl="8">
+      <w:start w:val="1"/>
+      <w:numFmt w:val="bullet"/>
+      <w:lvlText w:val="■"/>
+      <w:lvlJc w:val="left"/>
+      <w:pPr>
+        <w:ind w:left="6480" w:hanging="360"/>
+      </w:pPr>
+      <w:rPr>
+        <w:strike w:val="0"/>
+        <w:dstrike w:val="0"/>
+        <w:u w:val="none"/>
+        <w:effect w:val="none"/>
+      </w:rPr>
+    </w:lvl>
+  </w:abstractNum>
   <w:num w:numId="1" w16cid:durableId="1324771308">
     <w:abstractNumId w:val="1"/>
   </w:num>
   <w:num w:numId="2" w16cid:durableId="1973054631">
     <w:abstractNumId w:val="0"/>
+  </w:num>
+  <w:num w:numId="3" w16cid:durableId="1313364786">
+    <w:abstractNumId w:val="2"/>
+    <w:lvlOverride w:ilvl="0"/>
+    <w:lvlOverride w:ilvl="1"/>
+    <w:lvlOverride w:ilvl="2"/>
+    <w:lvlOverride w:ilvl="3"/>
+    <w:lvlOverride w:ilvl="4"/>
+    <w:lvlOverride w:ilvl="5"/>
+    <w:lvlOverride w:ilvl="6"/>
+    <w:lvlOverride w:ilvl="7"/>
+    <w:lvlOverride w:ilvl="8"/>
+  </w:num>
+  <w:num w:numId="4" w16cid:durableId="814639663">
+    <w:abstractNumId w:val="3"/>
+    <w:lvlOverride w:ilvl="0"/>
+    <w:lvlOverride w:ilvl="1"/>
+    <w:lvlOverride w:ilvl="2"/>
+    <w:lvlOverride w:ilvl="3"/>
+    <w:lvlOverride w:ilvl="4"/>
+    <w:lvlOverride w:ilvl="5"/>
+    <w:lvlOverride w:ilvl="6"/>
+    <w:lvlOverride w:ilvl="7"/>
+    <w:lvlOverride w:ilvl="8"/>
   </w:num>
 </w:numbering>
 </file>
@@ -1074,6 +1762,7 @@
   <w:style w:type="paragraph" w:default="1" w:styleId="Normal">
     <w:name w:val="Normal"/>
     <w:qFormat/>
+    <w:rsid w:val="00A25F3D"/>
   </w:style>
   <w:style w:type="paragraph" w:styleId="Heading1">
     <w:name w:val="heading 1"/>
@@ -1277,7 +1966,6 @@
   <w:style w:type="character" w:default="1" w:styleId="DefaultParagraphFont">
     <w:name w:val="Default Paragraph Font"/>
     <w:uiPriority w:val="1"/>
-    <w:semiHidden/>
     <w:unhideWhenUsed/>
   </w:style>
   <w:style w:type="table" w:default="1" w:styleId="TableNormal">

</xml_diff>